<commit_message>
Rebuild Delta and Valorant system analyses
</commit_message>
<xml_diff>
--- a/02 delta-operator-research/三角洲行动玩法分析.docx
+++ b/02 delta-operator-research/三角洲行动玩法分析.docx
@@ -5,19 +5,38 @@
     <w:p>
       <w:pPr>
         <w:pStyle w:val="Title"/>
+        <w:spacing w:before="1160"/>
       </w:pPr>
       <w:r>
-        <w:t>三角洲行动玩法分析</w:t>
+        <w:t>三角洲行动烽火地带玩法系统分析</w:t>
+      </w:r>
+    </w:p>
+    <w:p>
+      <w:pPr>
+        <w:ind w:firstLine="0"/>
+      </w:pPr>
+      <w:r>
+        <w:rPr>
+          <w:sz w:val="26"/>
+        </w:rPr>
+        <w:t>从一套配装到一次撤离 干员小队如何进入搜打撤决策</w:t>
+      </w:r>
+    </w:p>
+    <w:p>
+      <w:pPr>
+        <w:spacing w:before="360"/>
+        <w:ind w:firstLine="0"/>
+      </w:pPr>
+      <w:r>
+        <w:rPr>
+          <w:sz w:val="20"/>
+        </w:rPr>
+        <w:t>玩法系统研究  2026 年 9 月</w:t>
       </w:r>
     </w:p>
     <w:p>
       <w:r>
-        <w:t>三角洲的烽火地带有一个很容易被忽略的变化：进图时，玩家希望找到值钱的东西；真正找到以后，玩家又开始担心下一场交火。东西还放在同一个背包里，但这一局想做的事已经变了。搜集、装备、干员和撤离之间的关系，值得从这个变化往下看。</w:t>
-      </w:r>
-    </w:p>
-    <w:p>
-      <w:r>
-        <w:t>本文主要讨论烽火地带。全面战场也使用干员与枪械，但它的据点目标、复活规则和大队伍作战，不能直接套进搜打撤的分析里。</w:t>
+        <w:br w:type="page"/>
       </w:r>
     </w:p>
     <w:p>
@@ -25,18 +44,219 @@
         <w:pStyle w:val="Heading1"/>
       </w:pPr>
       <w:r>
-        <w:t>一 系统和功能</w:t>
+        <w:t>目录</w:t>
+      </w:r>
+    </w:p>
+    <w:p>
+      <w:pPr>
+        <w:spacing w:after="60"/>
+        <w:ind w:firstLine="0"/>
+      </w:pPr>
+      <w:r>
+        <w:t>01 游戏概览与分析口径</w:t>
+      </w:r>
+    </w:p>
+    <w:p>
+      <w:pPr>
+        <w:spacing w:after="60"/>
+        <w:ind w:firstLine="0"/>
+      </w:pPr>
+      <w:r>
+        <w:t>02 系统全景 一局如何同局外相连</w:t>
+      </w:r>
+    </w:p>
+    <w:p>
+      <w:pPr>
+        <w:spacing w:after="60"/>
+        <w:ind w:firstLine="0"/>
+      </w:pPr>
+      <w:r>
+        <w:t>03 核心循环 撤离才是价值兑现</w:t>
+      </w:r>
+    </w:p>
+    <w:p>
+      <w:pPr>
+        <w:spacing w:after="60"/>
+        <w:ind w:firstLine="0"/>
+      </w:pPr>
+      <w:r>
+        <w:t>04 配装系统 成本写在进图之前</w:t>
+      </w:r>
+    </w:p>
+    <w:p>
+      <w:pPr>
+        <w:spacing w:after="60"/>
+        <w:ind w:firstLine="0"/>
+      </w:pPr>
+      <w:r>
+        <w:t>05 搜索与背包 每次拾取都在改写路线</w:t>
+      </w:r>
+    </w:p>
+    <w:p>
+      <w:pPr>
+        <w:spacing w:after="60"/>
+        <w:ind w:firstLine="0"/>
+      </w:pPr>
+      <w:r>
+        <w:t>06 地图信息与撤离 结束点反向塑造路线</w:t>
+      </w:r>
+    </w:p>
+    <w:p>
+      <w:pPr>
+        <w:spacing w:after="60"/>
+        <w:ind w:firstLine="0"/>
+      </w:pPr>
+      <w:r>
+        <w:t>07 三个人不必凑齐四种职能</w:t>
+      </w:r>
+    </w:p>
+    <w:p>
+      <w:pPr>
+        <w:spacing w:after="60"/>
+        <w:ind w:firstLine="0"/>
+      </w:pPr>
+      <w:r>
+        <w:t>08 露娜：探到人之后，队伍才开始做决定</w:t>
+      </w:r>
+    </w:p>
+    <w:p>
+      <w:pPr>
+        <w:spacing w:after="60"/>
+        <w:ind w:firstLine="0"/>
+      </w:pPr>
+      <w:r>
+        <w:t>09 蜂医：恢复生命值，不等于恢复全部战斗力</w:t>
+      </w:r>
+    </w:p>
+    <w:p>
+      <w:pPr>
+        <w:spacing w:after="60"/>
+        <w:ind w:firstLine="0"/>
+      </w:pPr>
+      <w:r>
+        <w:t>10 红狼：第一次击倒改变后续推进成本</w:t>
+      </w:r>
+    </w:p>
+    <w:p>
+      <w:pPr>
+        <w:spacing w:after="60"/>
+        <w:ind w:firstLine="0"/>
+      </w:pPr>
+      <w:r>
+        <w:t>11 牧羊人：让对手有机会识别陷阱，是平衡的一部分</w:t>
+      </w:r>
+    </w:p>
+    <w:p>
+      <w:pPr>
+        <w:spacing w:after="60"/>
+        <w:ind w:firstLine="0"/>
+      </w:pPr>
+      <w:r>
+        <w:t>12 局面推演：满包小队要不要穿过开阔地？</w:t>
+      </w:r>
+    </w:p>
+    <w:p>
+      <w:pPr>
+        <w:spacing w:after="60"/>
+        <w:ind w:firstLine="0"/>
+      </w:pPr>
+      <w:r>
+        <w:t>13 拿掉一个工具，才能看清它原来解决什么</w:t>
+      </w:r>
+    </w:p>
+    <w:p>
+      <w:pPr>
+        <w:spacing w:after="60"/>
+        <w:ind w:firstLine="0"/>
+      </w:pPr>
+      <w:r>
+        <w:t>14 双模式平衡，先分目标，再分参数</w:t>
+      </w:r>
+    </w:p>
+    <w:p>
+      <w:pPr>
+        <w:spacing w:after="60"/>
+        <w:ind w:firstLine="0"/>
+      </w:pPr>
+      <w:r>
+        <w:t>15 先改善小队对技能的理解，不急着再加技能</w:t>
+      </w:r>
+    </w:p>
+    <w:p>
+      <w:pPr>
+        <w:spacing w:after="60"/>
+        <w:ind w:firstLine="0"/>
+      </w:pPr>
+      <w:r>
+        <w:t>16 结论与复核入口</w:t>
+      </w:r>
+    </w:p>
+    <w:p>
+      <w:r>
+        <w:br w:type="page"/>
+      </w:r>
+    </w:p>
+    <w:p>
+      <w:r>
+        <w:t>从一套配装到一次撤离 干员小队如何进入搜打撤决策</w:t>
+      </w:r>
+    </w:p>
+    <w:p>
+      <w:pPr>
+        <w:pStyle w:val="Heading1"/>
+      </w:pPr>
+      <w:r>
+        <w:t>01 游戏概览与分析口径</w:t>
+      </w:r>
+    </w:p>
+    <w:p>
+      <w:r>
+        <w:t>《三角洲行动》的烽火地带不是把击杀数写在结算页上的普通团队射击。玩家带着自己的装备入场，在地图里搜集物资、处理任务、遭遇玩家与 AI，最后还要抵达可用撤离点。带出去的东西才真正进入仓库；倒在地图里，大部分本局所得和带入装备都会失去，安全箱中的物品除外。[D0]</w:t>
+      </w:r>
+    </w:p>
+    <w:p>
+      <w:r>
+        <w:t>这份分析不做全功能百科，也不追逐当前版本强度榜。我更关心一个贯穿整局的问题：当背包价值、队伍状态和撤离条件不断变化时，玩家为什么继续搜、为什么接战、又为什么突然决定离开。干员系统放在这条决策链里观察，才能看出侦察、突破、支援和布防在搜打撤中与大战场不同的用法。</w:t>
+      </w:r>
+    </w:p>
+    <w:p>
+      <w:r>
+        <w:t>文章按四层展开。先看局内外系统怎样闭环，再拆配装、搜索、战斗和撤离；随后用四名代表干员观察三人小队的职能组合；最后用一个满包撤离局面和反事实比较检验结论。官方资料只支持规则事实，概率、路线和方案均标为本文推演。</w:t>
+      </w:r>
+    </w:p>
+    <w:p>
+      <w:pPr>
+        <w:pStyle w:val="Heading1"/>
+      </w:pPr>
+      <w:r>
+        <w:t>02 系统全景 一局如何同局外相连</w:t>
+      </w:r>
+    </w:p>
+    <w:p>
+      <w:r>
+        <w:t>从菜单看，仓库、任务、交易、特勤处和配装是不同入口；从玩家行动看，它们共同回答同一件事：下一局为了什么出发，又愿意押上多少成本。部门任务和设施升级制造材料需求，仓库提供库存，交易与补给把物资换成可用装备，配装再把其中一部分送进战局。[D0]</w:t>
+      </w:r>
+    </w:p>
+    <w:p>
+      <w:r>
+        <w:t>局内的搜索、交战和撤离不是三段互不相干的流程。搜索提高潜在收益，也增加停留时间和背包管理负担；交战可能夺得物资，也可能损失整套投入；撤离点把分散的路线重新压向少数出口。只要其中一环不成立，循环就会改变：搜到却带不出，收益没有兑现；有钱却不敢带装备，局外积累没有转成新的行动能力。</w:t>
+      </w:r>
+    </w:p>
+    <w:p>
+      <w:r>
+        <w:t>因此，系统分析不应只列“有什么功能”，还要标出资源从哪里来、在哪一步承担风险、何时完成结算。下图把核心闭环分成局外准备、局内决策和局后结算三层。</w:t>
       </w:r>
     </w:p>
     <w:p>
       <w:pPr>
         <w:ind w:firstLine="0"/>
+        <w:jc w:val="center"/>
       </w:pPr>
       <w:r>
         <w:drawing>
           <wp:inline xmlns:a="http://schemas.openxmlformats.org/drawingml/2006/main" xmlns:pic="http://schemas.openxmlformats.org/drawingml/2006/picture">
-            <wp:extent cx="5832000" cy="6065280"/>
-            <wp:docPr id="1" name="Picture 1" descr="烽火地带主要系统与功能，另附可放大矢量图及文字版"/>
+            <wp:extent cx="5760000" cy="3240000"/>
+            <wp:docPr id="1" name="Picture 1" descr="烽火地带局内外系统全景"/>
             <wp:cNvGraphicFramePr>
               <a:graphicFrameLocks noChangeAspect="1"/>
             </wp:cNvGraphicFramePr>
@@ -44,7 +264,7 @@
               <a:graphicData uri="http://schemas.openxmlformats.org/drawingml/2006/picture">
                 <pic:pic>
                   <pic:nvPicPr>
-                    <pic:cNvPr id="0" name="系统关系图.png"/>
+                    <pic:cNvPr id="0" name="delta-system.png"/>
                     <pic:cNvPicPr/>
                   </pic:nvPicPr>
                   <pic:blipFill>
@@ -56,7 +276,7 @@
                   <pic:spPr>
                     <a:xfrm>
                       <a:off x="0" y="0"/>
-                      <a:ext cx="5832000" cy="6065280"/>
+                      <a:ext cx="5760000" cy="3240000"/>
                     </a:xfrm>
                     <a:prstGeom prst="rect"/>
                   </pic:spPr>
@@ -68,8 +288,168 @@
       </w:r>
     </w:p>
     <w:p>
+      <w:pPr>
+        <w:spacing w:line="264" w:lineRule="auto"/>
+        <w:ind w:firstLine="0"/>
+        <w:jc w:val="center"/>
+      </w:pPr>
       <w:r>
-        <w:t>图中按玩家操作整理主要功能。背包里的物资要经过撤离才能大量转入局外资产，任务和制造需求又决定下一次想搜什么，因此这些功能不能只按大厅菜单理解。</w:t>
+        <w:t>图 烽火地带局内外系统全景。图中关系为本文归纳，不是客户端内部架构。</w:t>
+      </w:r>
+    </w:p>
+    <w:p>
+      <w:pPr>
+        <w:pStyle w:val="Heading1"/>
+      </w:pPr>
+      <w:r>
+        <w:t>03 核心循环 撤离才是价值兑现</w:t>
+      </w:r>
+    </w:p>
+    <w:p>
+      <w:r>
+        <w:t>把背包价值放进判断后，提升撤离概率的技能可能比增加本轮伤害更有用，但这个结论有条件。设 V 为当前仍可能损失的携带价值，G 为继续行动可能得到的额外收益，C 为新增弹药、治疗和时间成本；现在离开的成功率为 p0，继续后的成功率为 p1。忽略安全箱收益与个人风险偏好，继续需要满足 p1(V+G)-C &gt; p0V。</w:t>
+      </w:r>
+    </w:p>
+    <w:p>
+      <w:r>
+        <w:t>用任意单位演算：轻装时 V=20，继续可得 G=20、成本 C=4；满包时 V=80，其余不变。若 p0=95%、p1=75%，轻装继续的期望为 26，高于立即撤离的 19；满包继续只有 71，低于立即撤离的 76。若技能和队伍状态把 p1 推到 85%，满包继续才翻到 81。概率全是假设，这个模型不是胜率计算器，只用来说明同一个技能在不同背包状态下会有不同价值。</w:t>
+      </w:r>
+    </w:p>
+    <w:p>
+      <w:r>
+        <w:t>真正的核心循环因此不是“搜到人就打”，而是不断重估：当前收益是否值得继续暴露，队伍还有没有处理下一次意外的余量，撤离路线是否仍然可行。击杀是改变这些条件的手段，撤离才是把战局结果写回局外资产的结算。</w:t>
+      </w:r>
+    </w:p>
+    <w:p>
+      <w:pPr>
+        <w:ind w:firstLine="0"/>
+        <w:jc w:val="center"/>
+      </w:pPr>
+      <w:r>
+        <w:drawing>
+          <wp:inline xmlns:a="http://schemas.openxmlformats.org/drawingml/2006/main" xmlns:pic="http://schemas.openxmlformats.org/drawingml/2006/picture">
+            <wp:extent cx="5760000" cy="3240000"/>
+            <wp:docPr id="2" name="Picture 2" descr="从配装到结算的风险收益循环"/>
+            <wp:cNvGraphicFramePr>
+              <a:graphicFrameLocks noChangeAspect="1"/>
+            </wp:cNvGraphicFramePr>
+            <a:graphic>
+              <a:graphicData uri="http://schemas.openxmlformats.org/drawingml/2006/picture">
+                <pic:pic>
+                  <pic:nvPicPr>
+                    <pic:cNvPr id="0" name="delta-loop.png"/>
+                    <pic:cNvPicPr/>
+                  </pic:nvPicPr>
+                  <pic:blipFill>
+                    <a:blip r:embed="rId11"/>
+                    <a:stretch>
+                      <a:fillRect/>
+                    </a:stretch>
+                  </pic:blipFill>
+                  <pic:spPr>
+                    <a:xfrm>
+                      <a:off x="0" y="0"/>
+                      <a:ext cx="5760000" cy="3240000"/>
+                    </a:xfrm>
+                    <a:prstGeom prst="rect"/>
+                  </pic:spPr>
+                </pic:pic>
+              </a:graphicData>
+            </a:graphic>
+          </wp:inline>
+        </w:drawing>
+      </w:r>
+    </w:p>
+    <w:p>
+      <w:pPr>
+        <w:spacing w:line="264" w:lineRule="auto"/>
+        <w:ind w:firstLine="0"/>
+        <w:jc w:val="center"/>
+      </w:pPr>
+      <w:r>
+        <w:t>图 从配装到结算的风险收益循环。图中关系为本文归纳，不是客户端内部架构。</w:t>
+      </w:r>
+    </w:p>
+    <w:p>
+      <w:pPr>
+        <w:pStyle w:val="Heading1"/>
+      </w:pPr>
+      <w:r>
+        <w:t>04 配装系统 成本写在进图之前</w:t>
+      </w:r>
+    </w:p>
+    <w:p>
+      <w:r>
+        <w:t>配装把战术选择和损失绑定在一起。枪械与配件影响操控和适用距离，弹药与护甲关系影响有效击杀效率，医疗品处理生命与异常状态，胸挂、背包和安全箱则规定可携带空间与保底范围。[D0] 玩家不是在选一件最强装备，而是在决定本局准备处理什么局面，以及失败时能接受失去多少。</w:t>
+      </w:r>
+    </w:p>
+    <w:p>
+      <w:r>
+        <w:t>高投入并非单纯提高胜率。它一方面提高正面交战上限，另一方面抬高沉没成本，可能让玩家更早避战。低投入也不是纯粹吃亏：便宜配置允许更大胆地试路线、练枪或完成低价值任务，但面对高防护对手时容错更低。装备的设计价值来自这组同时存在的收益与压力。</w:t>
+      </w:r>
+    </w:p>
+    <w:p>
+      <w:r>
+        <w:t>配装券和任务奖励相当于重新出发的缓冲。它们降低一次失败之后的恢复成本，却不能替玩家解释为什么失败。若交战反馈无法区分枪法、弹药、防护和位置问题，再送一套装备只会重复一次不明不白的损失。</w:t>
+      </w:r>
+    </w:p>
+    <w:p>
+      <w:pPr>
+        <w:pStyle w:val="Heading1"/>
+      </w:pPr>
+      <w:r>
+        <w:t>05 搜索与背包 每次拾取都在改写路线</w:t>
+      </w:r>
+    </w:p>
+    <w:p>
+      <w:r>
+        <w:t>搜索的深度不只来自物品种类，而来自“装不下”和“用途不同”。一件物品可能用于出售、任务交付、设施升级或制造。卖价较低但恰好填补当前材料缺口的物品，会改变玩家对它的优先级；背包已满以后，继续搜索变成替换，而不再是无成本增加。[D0]</w:t>
+      </w:r>
+    </w:p>
+    <w:p>
+      <w:r>
+        <w:t>背包管理还会占用时间和注意力。刚结束交火时打开战利品界面，意味着暂时减少对周围声音和路线的处理。小队如果三个人同时搜尸，上一场战斗虽然获胜，下一场接敌的准备却被主动放弃。因此，“谁先搜、谁警戒、搜多久”本身就是战斗后的团队分工。</w:t>
+      </w:r>
+    </w:p>
+    <w:p>
+      <w:r>
+        <w:t>更关键的是目标会在拾取后翻转。空包时，高价值区解决的是“我还没有收益”；拿到任务物资或稀有物品以后，同一片区域变成“它还可能夺走现有收益”。优秀的搜打撤地图会允许玩家因此换路、提前撤或继续加注，而不是只提供一条固定刷取路线。</w:t>
+      </w:r>
+    </w:p>
+    <w:p>
+      <w:pPr>
+        <w:pStyle w:val="Heading1"/>
+      </w:pPr>
+      <w:r>
+        <w:t>06 地图信息与撤离 结束点反向塑造路线</w:t>
+      </w:r>
+    </w:p>
+    <w:p>
+      <w:r>
+        <w:t>地图里的资源区、通路、掩体、出生点和撤离点共同组织交战密度。高价值标记提高搜索吸引力，也让多支小队可能朝同一位置靠拢；枪声、脚步、开门痕迹和被清理的 AI 则把其他玩家的行动留在环境里。信息不会直接给出答案，只会改变某条路线的可信度。[D0]</w:t>
+      </w:r>
+    </w:p>
+    <w:p>
+      <w:r>
+        <w:t>撤离点不是放在地图边缘的结束按钮。固定、条件、付费或需要触发的出口，会反向影响配装、携带物资和剩余时间。越接近关局，分散在地图中的队伍越可能被少数可用出口重新汇聚，原本安全的路线也会因为时间压力变成必经之路。</w:t>
+      </w:r>
+    </w:p>
+    <w:p>
+      <w:r>
+        <w:t>这使得“最短路线”和“最安全路线”很少完全重合。短线减少暴露时间，却可能经过已知枪线；侧路利用遮挡，却增加未知出口与超时风险。干员技能只有接到具体通路、队友位置和剩余时间上，才会形成真正的路线选择。</w:t>
+      </w:r>
+    </w:p>
+    <w:p>
+      <w:pPr>
+        <w:pStyle w:val="Heading1"/>
+      </w:pPr>
+      <w:r>
+        <w:t>07 三个人不必凑齐四种职能</w:t>
+      </w:r>
+    </w:p>
+    <w:p>
+      <w:r>
+        <w:t>三人小队与四类职能制造了选择空间，但“少一个职能”不等于“必然缺一项能力”。要检查的是具体工具。</w:t>
       </w:r>
     </w:p>
     <w:p>
@@ -77,22 +457,12 @@
         <w:pStyle w:val="Heading2"/>
       </w:pPr>
       <w:r>
-        <w:t>配装和仓库</w:t>
+        <w:t>先列任务，不先填职业格</w:t>
       </w:r>
     </w:p>
     <w:p>
       <w:r>
-        <w:t>仓库保存装备和带出的物品，配装界面把其中一部分交给本局角色使用。玩家需要准备武器、弹药、防护与医疗物资，也要考虑背包能装多少东西。枪械改装会影响操控和使用习惯；弹药与防护之间的关系，则会影响一次命中能造成多少实际伤害。[1]</w:t>
-      </w:r>
-    </w:p>
-    <w:p>
-      <w:r>
-        <w:t>这里至少有两种不同的选择。选一把更顺手的枪，是在改善操作；给同一把枪配什么弹药，是在决定这套装备准备应付什么对手。预算有限时，把钱都花在外观熟悉、配件齐全的枪上，未必能得到相应的交战优势。分析配装时应该把枪、弹和甲放在一起看，单看枪械面板容易漏掉真正的问题。</w:t>
-      </w:r>
-    </w:p>
-    <w:p>
-      <w:r>
-        <w:t>仓库还让玩家有了局外的回旋余地。一局损失以后，可以换用存货或降低下一局投入，而不用沿用刚才那套打法。这个余地越充足，玩家越有条件试新枪、走不熟悉的路线。反过来，当剩下的装备已经不多时，同样一次失败会更难接受。</w:t>
+        <w:t>一条路线可能要求确认远处枪线、穿过出口、处理受伤队友，再阻止追击。应先问队伍需要完成哪些动作，再看技能、携带道具和路线能否一起覆盖。红狼自己有烟雾，蜂医也不只会抬血。</w:t>
       </w:r>
     </w:p>
     <w:p>
@@ -100,22 +470,12 @@
         <w:pStyle w:val="Heading2"/>
       </w:pPr>
       <w:r>
-        <w:t>地图搜集和撤离</w:t>
+        <w:t>重叠不一定浪费</w:t>
       </w:r>
     </w:p>
     <w:p>
       <w:r>
-        <w:t>玩家进入地图后，可以搜索容器、拾取物品、处理任务，也可能遭遇 AI 敌人和其他干员小队。撤离点把行动收束到地图上的具体位置，有些撤离点还附带条件。地图工具因此不只是导航，它也帮助玩家判断路线最后能不能走通。[1][2]</w:t>
-      </w:r>
-    </w:p>
-    <w:p>
-      <w:r>
-        <w:t>物品有出售、任务和制造等用途。于是，值不值得捡不能只看稀有度：一个售价普通、但恰好是当前升级缺口的材料，可能比另一件卖价更高的东西更值得保留。这种需求会让同一地点在不同阶段有不同吸引力。</w:t>
-      </w:r>
-    </w:p>
-    <w:p>
-      <w:r>
-        <w:t>背包容量把搜集变成了取舍。装不下以后，玩家需要腾格子、换物品或者结束搜索。整理背包本身还占用注意力；如果刚打完一场交火，周围是否安全没有确认，此时花时间比较战利品，就可能给后来者留下机会。这是物品管理与战斗发生联系的地方。</w:t>
+        <w:t>两人都能遮挡视线，可以轮流服务去程和回程。反过来，选了三个不同职能，也可能都无法处理某个高点。能力是否重叠必须结合使用时机和作用位置判断。</w:t>
       </w:r>
     </w:p>
     <w:p>
@@ -123,22 +483,609 @@
         <w:pStyle w:val="Heading2"/>
       </w:pPr>
       <w:r>
-        <w:t>干员和小队</w:t>
+        <w:t>代价要写出来</w:t>
       </w:r>
     </w:p>
     <w:p>
       <w:r>
-        <w:t>干员提供不同的技能组合。红狼偏向机动与突击，露娜提供侦察手段，蜂医有治疗及烟幕相关能力，牧羊人可以用声波装置干扰或防守。这些只是代表，不构成固定的最佳阵容。[3]</w:t>
+        <w:t>偏突破的小队可能更容易抢出一段空间，却要用药品和保守路线补恢复缺口；偏撤离的小队可能更容易处理战后状态，却不适合追着敌人连续换点。这里比较的是任务适配，不是预设哪个阵容更强。</w:t>
       </w:r>
     </w:p>
     <w:p>
       <w:r>
-        <w:t>三人小队里的每个人都要开枪、搜集和撤离，职责不会像纯粹的治疗、坦克、输出那样完全分开。技能更像是在共同任务中补上一种手段：过开阔地缺遮挡，交战前缺信息，队友倒地后缺恢复与掩护。选干员时，应该先看小队打算怎样行动，再看有没有相应手段。</w:t>
+        <w:t>图表：四个代表样本，按主要用途归纳</w:t>
+      </w:r>
+    </w:p>
+    <w:tbl>
+      <w:tblPr>
+        <w:tblW w:type="auto" w:w="0"/>
+        <w:tblLayout w:type="fixed"/>
+        <w:tblLook w:firstColumn="1" w:firstRow="1" w:lastColumn="0" w:lastRow="0" w:noHBand="0" w:noVBand="1" w:val="04A0"/>
+      </w:tblPr>
+      <w:tblGrid>
+        <w:gridCol w:w="3099"/>
+        <w:gridCol w:w="3099"/>
+        <w:gridCol w:w="3099"/>
+      </w:tblGrid>
+      <w:tr>
+        <w:trPr>
+          <w:tblHeader/>
+        </w:trPr>
+        <w:tc>
+          <w:tcPr>
+            <w:tcW w:type="dxa" w:w="3099"/>
+            <w:vAlign w:val="center"/>
+            <w:shd w:fill="3f6f62"/>
+            <w:tcMar>
+              <w:top w:w="100" w:type="dxa"/>
+              <w:left w:w="100" w:type="dxa"/>
+              <w:bottom w:w="100" w:type="dxa"/>
+              <w:right w:w="100" w:type="dxa"/>
+            </w:tcMar>
+          </w:tcPr>
+          <w:p>
+            <w:pPr>
+              <w:spacing w:after="0"/>
+              <w:ind w:firstLine="0"/>
+            </w:pPr>
+            <w:r>
+              <w:rPr>
+                <w:b/>
+                <w:color w:val="FFFFFF"/>
+                <w:sz w:val="17"/>
+              </w:rPr>
+              <w:t>样本</w:t>
+            </w:r>
+          </w:p>
+        </w:tc>
+        <w:tc>
+          <w:tcPr>
+            <w:tcW w:type="dxa" w:w="3099"/>
+            <w:vAlign w:val="center"/>
+            <w:shd w:fill="3f6f62"/>
+            <w:tcMar>
+              <w:top w:w="100" w:type="dxa"/>
+              <w:left w:w="100" w:type="dxa"/>
+              <w:bottom w:w="100" w:type="dxa"/>
+              <w:right w:w="100" w:type="dxa"/>
+            </w:tcMar>
+          </w:tcPr>
+          <w:p>
+            <w:pPr>
+              <w:spacing w:after="0"/>
+              <w:ind w:firstLine="0"/>
+            </w:pPr>
+            <w:r>
+              <w:rPr>
+                <w:b/>
+                <w:color w:val="FFFFFF"/>
+                <w:sz w:val="17"/>
+              </w:rPr>
+              <w:t>优先处理</w:t>
+            </w:r>
+          </w:p>
+        </w:tc>
+        <w:tc>
+          <w:tcPr>
+            <w:tcW w:type="dxa" w:w="3099"/>
+            <w:vAlign w:val="center"/>
+            <w:shd w:fill="3f6f62"/>
+            <w:tcMar>
+              <w:top w:w="100" w:type="dxa"/>
+              <w:left w:w="100" w:type="dxa"/>
+              <w:bottom w:w="100" w:type="dxa"/>
+              <w:right w:w="100" w:type="dxa"/>
+            </w:tcMar>
+          </w:tcPr>
+          <w:p>
+            <w:pPr>
+              <w:spacing w:after="0"/>
+              <w:ind w:firstLine="0"/>
+            </w:pPr>
+            <w:r>
+              <w:rPr>
+                <w:b/>
+                <w:color w:val="FFFFFF"/>
+                <w:sz w:val="17"/>
+              </w:rPr>
+              <w:t>队伍仍需解决</w:t>
+            </w:r>
+          </w:p>
+        </w:tc>
+      </w:tr>
+      <w:tr>
+        <w:tc>
+          <w:tcPr>
+            <w:tcW w:type="dxa" w:w="3099"/>
+            <w:vAlign w:val="center"/>
+            <w:shd w:fill="F5F6F5"/>
+            <w:tcMar>
+              <w:top w:w="100" w:type="dxa"/>
+              <w:left w:w="100" w:type="dxa"/>
+              <w:bottom w:w="100" w:type="dxa"/>
+              <w:right w:w="100" w:type="dxa"/>
+            </w:tcMar>
+          </w:tcPr>
+          <w:p>
+            <w:pPr>
+              <w:spacing w:after="0"/>
+              <w:ind w:firstLine="0"/>
+            </w:pPr>
+            <w:r>
+              <w:rPr>
+                <w:b w:val="0"/>
+                <w:color w:val="222222"/>
+                <w:sz w:val="17"/>
+              </w:rPr>
+              <w:t>红狼 / 突击</w:t>
+            </w:r>
+          </w:p>
+        </w:tc>
+        <w:tc>
+          <w:tcPr>
+            <w:tcW w:type="dxa" w:w="3099"/>
+            <w:vAlign w:val="center"/>
+            <w:shd w:fill="F5F6F5"/>
+            <w:tcMar>
+              <w:top w:w="100" w:type="dxa"/>
+              <w:left w:w="100" w:type="dxa"/>
+              <w:bottom w:w="100" w:type="dxa"/>
+              <w:right w:w="100" w:type="dxa"/>
+            </w:tcMar>
+          </w:tcPr>
+          <w:p>
+            <w:pPr>
+              <w:spacing w:after="0"/>
+              <w:ind w:firstLine="0"/>
+            </w:pPr>
+            <w:r>
+              <w:rPr>
+                <w:b w:val="0"/>
+                <w:color w:val="222222"/>
+                <w:sz w:val="17"/>
+              </w:rPr>
+              <w:t>短时突破与追击</w:t>
+            </w:r>
+          </w:p>
+        </w:tc>
+        <w:tc>
+          <w:tcPr>
+            <w:tcW w:type="dxa" w:w="3099"/>
+            <w:vAlign w:val="center"/>
+            <w:shd w:fill="F5F6F5"/>
+            <w:tcMar>
+              <w:top w:w="100" w:type="dxa"/>
+              <w:left w:w="100" w:type="dxa"/>
+              <w:bottom w:w="100" w:type="dxa"/>
+              <w:right w:w="100" w:type="dxa"/>
+            </w:tcMar>
+          </w:tcPr>
+          <w:p>
+            <w:pPr>
+              <w:spacing w:after="0"/>
+              <w:ind w:firstLine="0"/>
+            </w:pPr>
+            <w:r>
+              <w:rPr>
+                <w:b w:val="0"/>
+                <w:color w:val="222222"/>
+                <w:sz w:val="17"/>
+              </w:rPr>
+              <w:t>前方是否还有第二条枪线</w:t>
+            </w:r>
+          </w:p>
+        </w:tc>
+      </w:tr>
+      <w:tr>
+        <w:tc>
+          <w:tcPr>
+            <w:tcW w:type="dxa" w:w="3099"/>
+            <w:vAlign w:val="center"/>
+            <w:shd w:fill="F5F6F5"/>
+            <w:tcMar>
+              <w:top w:w="100" w:type="dxa"/>
+              <w:left w:w="100" w:type="dxa"/>
+              <w:bottom w:w="100" w:type="dxa"/>
+              <w:right w:w="100" w:type="dxa"/>
+            </w:tcMar>
+          </w:tcPr>
+          <w:p>
+            <w:pPr>
+              <w:spacing w:after="0"/>
+              <w:ind w:firstLine="0"/>
+            </w:pPr>
+            <w:r>
+              <w:rPr>
+                <w:b w:val="0"/>
+                <w:color w:val="222222"/>
+                <w:sz w:val="17"/>
+              </w:rPr>
+              <w:t>露娜 / 侦察</w:t>
+            </w:r>
+          </w:p>
+        </w:tc>
+        <w:tc>
+          <w:tcPr>
+            <w:tcW w:type="dxa" w:w="3099"/>
+            <w:vAlign w:val="center"/>
+            <w:shd w:fill="F5F6F5"/>
+            <w:tcMar>
+              <w:top w:w="100" w:type="dxa"/>
+              <w:left w:w="100" w:type="dxa"/>
+              <w:bottom w:w="100" w:type="dxa"/>
+              <w:right w:w="100" w:type="dxa"/>
+            </w:tcMar>
+          </w:tcPr>
+          <w:p>
+            <w:pPr>
+              <w:spacing w:after="0"/>
+              <w:ind w:firstLine="0"/>
+            </w:pPr>
+            <w:r>
+              <w:rPr>
+                <w:b w:val="0"/>
+                <w:color w:val="222222"/>
+                <w:sz w:val="17"/>
+              </w:rPr>
+              <w:t>缩小敌位不确定性</w:t>
+            </w:r>
+          </w:p>
+        </w:tc>
+        <w:tc>
+          <w:tcPr>
+            <w:tcW w:type="dxa" w:w="3099"/>
+            <w:vAlign w:val="center"/>
+            <w:shd w:fill="F5F6F5"/>
+            <w:tcMar>
+              <w:top w:w="100" w:type="dxa"/>
+              <w:left w:w="100" w:type="dxa"/>
+              <w:bottom w:w="100" w:type="dxa"/>
+              <w:right w:w="100" w:type="dxa"/>
+            </w:tcMar>
+          </w:tcPr>
+          <w:p>
+            <w:pPr>
+              <w:spacing w:after="0"/>
+              <w:ind w:firstLine="0"/>
+            </w:pPr>
+            <w:r>
+              <w:rPr>
+                <w:b w:val="0"/>
+                <w:color w:val="222222"/>
+                <w:sz w:val="17"/>
+              </w:rPr>
+              <w:t>谁能在信息有效时行动</w:t>
+            </w:r>
+          </w:p>
+        </w:tc>
+      </w:tr>
+      <w:tr>
+        <w:tc>
+          <w:tcPr>
+            <w:tcW w:type="dxa" w:w="3099"/>
+            <w:vAlign w:val="center"/>
+            <w:shd w:fill="F5F6F5"/>
+            <w:tcMar>
+              <w:top w:w="100" w:type="dxa"/>
+              <w:left w:w="100" w:type="dxa"/>
+              <w:bottom w:w="100" w:type="dxa"/>
+              <w:right w:w="100" w:type="dxa"/>
+            </w:tcMar>
+          </w:tcPr>
+          <w:p>
+            <w:pPr>
+              <w:spacing w:after="0"/>
+              <w:ind w:firstLine="0"/>
+            </w:pPr>
+            <w:r>
+              <w:rPr>
+                <w:b w:val="0"/>
+                <w:color w:val="222222"/>
+                <w:sz w:val="17"/>
+              </w:rPr>
+              <w:t>蜂医 / 支援</w:t>
+            </w:r>
+          </w:p>
+        </w:tc>
+        <w:tc>
+          <w:tcPr>
+            <w:tcW w:type="dxa" w:w="3099"/>
+            <w:vAlign w:val="center"/>
+            <w:shd w:fill="F5F6F5"/>
+            <w:tcMar>
+              <w:top w:w="100" w:type="dxa"/>
+              <w:left w:w="100" w:type="dxa"/>
+              <w:bottom w:w="100" w:type="dxa"/>
+              <w:right w:w="100" w:type="dxa"/>
+            </w:tcMar>
+          </w:tcPr>
+          <w:p>
+            <w:pPr>
+              <w:spacing w:after="0"/>
+              <w:ind w:firstLine="0"/>
+            </w:pPr>
+            <w:r>
+              <w:rPr>
+                <w:b w:val="0"/>
+                <w:color w:val="222222"/>
+                <w:sz w:val="17"/>
+              </w:rPr>
+              <w:t>受伤后的恢复</w:t>
+            </w:r>
+          </w:p>
+        </w:tc>
+        <w:tc>
+          <w:tcPr>
+            <w:tcW w:type="dxa" w:w="3099"/>
+            <w:vAlign w:val="center"/>
+            <w:shd w:fill="F5F6F5"/>
+            <w:tcMar>
+              <w:top w:w="100" w:type="dxa"/>
+              <w:left w:w="100" w:type="dxa"/>
+              <w:bottom w:w="100" w:type="dxa"/>
+              <w:right w:w="100" w:type="dxa"/>
+            </w:tcMar>
+          </w:tcPr>
+          <w:p>
+            <w:pPr>
+              <w:spacing w:after="0"/>
+              <w:ind w:firstLine="0"/>
+            </w:pPr>
+            <w:r>
+              <w:rPr>
+                <w:b w:val="0"/>
+                <w:color w:val="222222"/>
+                <w:sz w:val="17"/>
+              </w:rPr>
+              <w:t>弹药、护甲与安全位置</w:t>
+            </w:r>
+          </w:p>
+        </w:tc>
+      </w:tr>
+      <w:tr>
+        <w:tc>
+          <w:tcPr>
+            <w:tcW w:type="dxa" w:w="3099"/>
+            <w:vAlign w:val="center"/>
+            <w:shd w:fill="F5F6F5"/>
+            <w:tcMar>
+              <w:top w:w="100" w:type="dxa"/>
+              <w:left w:w="100" w:type="dxa"/>
+              <w:bottom w:w="100" w:type="dxa"/>
+              <w:right w:w="100" w:type="dxa"/>
+            </w:tcMar>
+          </w:tcPr>
+          <w:p>
+            <w:pPr>
+              <w:spacing w:after="0"/>
+              <w:ind w:firstLine="0"/>
+            </w:pPr>
+            <w:r>
+              <w:rPr>
+                <w:b w:val="0"/>
+                <w:color w:val="222222"/>
+                <w:sz w:val="17"/>
+              </w:rPr>
+              <w:t>牧羊人 / 工程</w:t>
+            </w:r>
+          </w:p>
+        </w:tc>
+        <w:tc>
+          <w:tcPr>
+            <w:tcW w:type="dxa" w:w="3099"/>
+            <w:vAlign w:val="center"/>
+            <w:shd w:fill="F5F6F5"/>
+            <w:tcMar>
+              <w:top w:w="100" w:type="dxa"/>
+              <w:left w:w="100" w:type="dxa"/>
+              <w:bottom w:w="100" w:type="dxa"/>
+              <w:right w:w="100" w:type="dxa"/>
+            </w:tcMar>
+          </w:tcPr>
+          <w:p>
+            <w:pPr>
+              <w:spacing w:after="0"/>
+              <w:ind w:firstLine="0"/>
+            </w:pPr>
+            <w:r>
+              <w:rPr>
+                <w:b w:val="0"/>
+                <w:color w:val="222222"/>
+                <w:sz w:val="17"/>
+              </w:rPr>
+              <w:t>限制入口与追击</w:t>
+            </w:r>
+          </w:p>
+        </w:tc>
+        <w:tc>
+          <w:tcPr>
+            <w:tcW w:type="dxa" w:w="3099"/>
+            <w:vAlign w:val="center"/>
+            <w:shd w:fill="F5F6F5"/>
+            <w:tcMar>
+              <w:top w:w="100" w:type="dxa"/>
+              <w:left w:w="100" w:type="dxa"/>
+              <w:bottom w:w="100" w:type="dxa"/>
+              <w:right w:w="100" w:type="dxa"/>
+            </w:tcMar>
+          </w:tcPr>
+          <w:p>
+            <w:pPr>
+              <w:spacing w:after="0"/>
+              <w:ind w:firstLine="0"/>
+            </w:pPr>
+            <w:r>
+              <w:rPr>
+                <w:b w:val="0"/>
+                <w:color w:val="222222"/>
+                <w:sz w:val="17"/>
+              </w:rPr>
+              <w:t>敌人是否换路或远距处理</w:t>
+            </w:r>
+          </w:p>
+        </w:tc>
+      </w:tr>
+      <w:tr>
+        <w:tc>
+          <w:tcPr>
+            <w:tcW w:type="dxa" w:w="3099"/>
+            <w:vAlign w:val="center"/>
+            <w:shd w:fill="F5F6F5"/>
+            <w:tcMar>
+              <w:top w:w="100" w:type="dxa"/>
+              <w:left w:w="100" w:type="dxa"/>
+              <w:bottom w:w="100" w:type="dxa"/>
+              <w:right w:w="100" w:type="dxa"/>
+            </w:tcMar>
+          </w:tcPr>
+          <w:p>
+            <w:pPr>
+              <w:spacing w:after="0"/>
+              <w:ind w:firstLine="0"/>
+            </w:pPr>
+            <w:r>
+              <w:rPr>
+                <w:b w:val="0"/>
+                <w:color w:val="222222"/>
+                <w:sz w:val="17"/>
+              </w:rPr>
+              <w:t>普通道具 / 站位</w:t>
+            </w:r>
+          </w:p>
+        </w:tc>
+        <w:tc>
+          <w:tcPr>
+            <w:tcW w:type="dxa" w:w="3099"/>
+            <w:vAlign w:val="center"/>
+            <w:shd w:fill="F5F6F5"/>
+            <w:tcMar>
+              <w:top w:w="100" w:type="dxa"/>
+              <w:left w:w="100" w:type="dxa"/>
+              <w:bottom w:w="100" w:type="dxa"/>
+              <w:right w:w="100" w:type="dxa"/>
+            </w:tcMar>
+          </w:tcPr>
+          <w:p>
+            <w:pPr>
+              <w:spacing w:after="0"/>
+              <w:ind w:firstLine="0"/>
+            </w:pPr>
+            <w:r>
+              <w:rPr>
+                <w:b w:val="0"/>
+                <w:color w:val="222222"/>
+                <w:sz w:val="17"/>
+              </w:rPr>
+              <w:t>补足部分功能</w:t>
+            </w:r>
+          </w:p>
+        </w:tc>
+        <w:tc>
+          <w:tcPr>
+            <w:tcW w:type="dxa" w:w="3099"/>
+            <w:vAlign w:val="center"/>
+            <w:shd w:fill="F5F6F5"/>
+            <w:tcMar>
+              <w:top w:w="100" w:type="dxa"/>
+              <w:left w:w="100" w:type="dxa"/>
+              <w:bottom w:w="100" w:type="dxa"/>
+              <w:right w:w="100" w:type="dxa"/>
+            </w:tcMar>
+          </w:tcPr>
+          <w:p>
+            <w:pPr>
+              <w:spacing w:after="0"/>
+              <w:ind w:firstLine="0"/>
+            </w:pPr>
+            <w:r>
+              <w:rPr>
+                <w:b w:val="0"/>
+                <w:color w:val="222222"/>
+                <w:sz w:val="17"/>
+              </w:rPr>
+              <w:t>数量、花费与操作机会</w:t>
+            </w:r>
+          </w:p>
+        </w:tc>
+      </w:tr>
+    </w:tbl>
+    <w:p/>
+    <w:p>
+      <w:r>
+        <w:t>阵容分析应落到“这个局面由谁处理”。只列突击、侦察、支援、工程四个标签，不足以说明小队配合。</w:t>
+      </w:r>
+    </w:p>
+    <w:p>
+      <w:pPr>
+        <w:spacing w:line="264" w:lineRule="auto"/>
+        <w:ind w:firstLine="0"/>
+        <w:jc w:val="center"/>
+      </w:pPr>
+      <w:r>
+        <w:t>来源：D1、D2、D3</w:t>
+      </w:r>
+    </w:p>
+    <w:p>
+      <w:pPr>
+        <w:ind w:firstLine="0"/>
+        <w:jc w:val="center"/>
+      </w:pPr>
+      <w:r>
+        <w:drawing>
+          <wp:inline xmlns:a="http://schemas.openxmlformats.org/drawingml/2006/main" xmlns:pic="http://schemas.openxmlformats.org/drawingml/2006/picture">
+            <wp:extent cx="5760000" cy="3240000"/>
+            <wp:docPr id="3" name="Picture 3" descr="三人小队的任务缺口与工具补位"/>
+            <wp:cNvGraphicFramePr>
+              <a:graphicFrameLocks noChangeAspect="1"/>
+            </wp:cNvGraphicFramePr>
+            <a:graphic>
+              <a:graphicData uri="http://schemas.openxmlformats.org/drawingml/2006/picture">
+                <pic:pic>
+                  <pic:nvPicPr>
+                    <pic:cNvPr id="0" name="delta-squad.png"/>
+                    <pic:cNvPicPr/>
+                  </pic:nvPicPr>
+                  <pic:blipFill>
+                    <a:blip r:embed="rId12"/>
+                    <a:stretch>
+                      <a:fillRect/>
+                    </a:stretch>
+                  </pic:blipFill>
+                  <pic:spPr>
+                    <a:xfrm>
+                      <a:off x="0" y="0"/>
+                      <a:ext cx="5760000" cy="3240000"/>
+                    </a:xfrm>
+                    <a:prstGeom prst="rect"/>
+                  </pic:spPr>
+                </pic:pic>
+              </a:graphicData>
+            </a:graphic>
+          </wp:inline>
+        </w:drawing>
+      </w:r>
+    </w:p>
+    <w:p>
+      <w:pPr>
+        <w:spacing w:line="264" w:lineRule="auto"/>
+        <w:ind w:firstLine="0"/>
+        <w:jc w:val="center"/>
+      </w:pPr>
+      <w:r>
+        <w:t>图 三人小队的任务缺口与工具补位。图中关系为本文归纳，不是客户端内部架构。</w:t>
+      </w:r>
+    </w:p>
+    <w:p>
+      <w:pPr>
+        <w:pStyle w:val="Heading1"/>
+      </w:pPr>
+      <w:r>
+        <w:t>08 露娜：探到人之后，队伍才开始做决定</w:t>
       </w:r>
     </w:p>
     <w:p>
       <w:r>
-        <w:t>例如，一队人都喜欢抢先接战，队伍可能不缺第一轮进攻能力，却在交战结束后很难安全整理状态。增加支援能力能缓解这个问题，但代价是少一个其他类型的技能组合。人数限制让这种取舍有意义，也使熟人配合和临时组队呈现出不同难度。</w:t>
+        <w:t>信息技能的直接产物是线索，后续收益取决于它是否赶得上小队的行动。探到人也可能意味着该换路。</w:t>
       </w:r>
     </w:p>
     <w:p>
@@ -146,22 +1093,90 @@
         <w:pStyle w:val="Heading2"/>
       </w:pPr>
       <w:r>
-        <w:t>任务 交易和特勤处</w:t>
+        <w:t>事实与分析分开</w:t>
       </w:r>
     </w:p>
     <w:p>
       <w:r>
-        <w:t>部门任务提供阶段目标及奖励，并与后续解锁发生联系；补给和交易让物资转成下一局能用的装备；特勤处的设施、制造与升级又会产生材料需求。[1][4]</w:t>
+        <w:t>官方历史公告确认露娜探测工具在 Operations 有独立调整，并曾影响被探测目标的治疗物品冷却。本文不沿用其旧冷却值描述当前国服，也不把她的判定方式等同于 Sova。</w:t>
+      </w:r>
+    </w:p>
+    <w:p>
+      <w:pPr>
+        <w:pStyle w:val="Heading2"/>
+      </w:pPr>
+      <w:r>
+        <w:t>信息不是无限保鲜</w:t>
       </w:r>
     </w:p>
     <w:p>
       <w:r>
-        <w:t>如果只有出售赚钱，很多物品最后都可以被压成一个价格。任务和制造让物品保留了别的用途，也给缺乏自定目标的玩家一个出发理由。今天缺什么、准备去哪里找、值得带多好的装备，逐渐成为同一个问题。</w:t>
+        <w:t>假设技能确认右侧有人，队友却仍在楼内搜物资。等三人重新集合，这个线索可能已不支持立即前压。此时应重新确认路径，不能因为刚才出现过标记，就把整片区域当成持续受控。</w:t>
+      </w:r>
+    </w:p>
+    <w:p>
+      <w:pPr>
+        <w:pStyle w:val="Heading2"/>
+      </w:pPr>
+      <w:r>
+        <w:t>空结果尤其容易误读</w:t>
       </w:r>
     </w:p>
     <w:p>
       <w:r>
-        <w:t>代价也很明显。玩家必须记住更多东西，撤离之后还要处理仓库、交易和生产。喜欢搜集经营的人可能愿意做这些；主要想打枪的人则可能把它们当成两局之间的手续。不能因为局外功能很多，就认为它们必然更有深度。关键要看整理和积累有没有改变下一局的安排。</w:t>
+        <w:t>没有反馈，只能说明本次没有得到目标信息。覆盖位置、敌人移动与技能规则都会影响结果。若要把“没探到”升级成“能安全通过”，还需要视野、听声或队友站位来补证。</w:t>
+      </w:r>
+    </w:p>
+    <w:p>
+      <w:r>
+        <w:t>图表：同一次探测可能导向不同选择</w:t>
+      </w:r>
+    </w:p>
+    <w:p>
+      <w:pPr>
+        <w:ind w:firstLine="0" w:left="397"/>
+      </w:pPr>
+      <w:r>
+        <w:t>1. 确认一处敌位：只获得局部线索</w:t>
+      </w:r>
+    </w:p>
+    <w:p>
+      <w:pPr>
+        <w:ind w:firstLine="0" w:left="397"/>
+      </w:pPr>
+      <w:r>
+        <w:t>2. 队友能立即跟进：压迫该位置，或趁另一侧空档通过</w:t>
+      </w:r>
+    </w:p>
+    <w:p>
+      <w:pPr>
+        <w:ind w:firstLine="0" w:left="397"/>
+      </w:pPr>
+      <w:r>
+        <w:t>3. 队友距离过远：保留警戒，不能直接前压</w:t>
+      </w:r>
+    </w:p>
+    <w:p>
+      <w:pPr>
+        <w:ind w:firstLine="0" w:left="397"/>
+      </w:pPr>
+      <w:r>
+        <w:t>4. 收益已足够：利用敌位选择绕行，不追求击杀</w:t>
+      </w:r>
+    </w:p>
+    <w:p>
+      <w:r>
+        <w:t>应记录探测后的路线、时机和接战变化。单独统计探测人数，很难区分有用的信息与没有被利用的信息。</w:t>
+      </w:r>
+    </w:p>
+    <w:p>
+      <w:pPr>
+        <w:spacing w:line="264" w:lineRule="auto"/>
+        <w:ind w:firstLine="0"/>
+        <w:jc w:val="center"/>
+      </w:pPr>
+      <w:r>
+        <w:t>来源：D2</w:t>
       </w:r>
     </w:p>
     <w:p>
@@ -169,12 +1184,12 @@
         <w:pStyle w:val="Heading1"/>
       </w:pPr>
       <w:r>
-        <w:t>二 接触系统的顺序</w:t>
+        <w:t>09 蜂医：恢复生命值，不等于恢复全部战斗力</w:t>
       </w:r>
     </w:p>
     <w:p>
       <w:r>
-        <w:t>下面按理解玩法的先后整理，不作为客户端教程或功能解锁顺序的记录。烽火地带的大量信息同时出现在大厅里，但新手没有必要一次学完。</w:t>
+        <w:t>治疗后的队伍是否适合再打一波，要同时看状态、位置和下一次接敌时间。血条回满只是其中一项。</w:t>
       </w:r>
     </w:p>
     <w:p>
@@ -182,17 +1197,12 @@
         <w:pStyle w:val="Heading2"/>
       </w:pPr>
       <w:r>
-        <w:t>先完成一次带东西离开地图的过程</w:t>
+        <w:t>一次历史改动说明了什么</w:t>
       </w:r>
     </w:p>
     <w:p>
       <w:r>
-        <w:t>第一步应当把配装、进图、搜索和撤离连起来。只要能明白哪些装备是自己带入的、哪些东西是刚捡到的，以及为什么必须走到撤离点，这个模式就有了基本轮廓。此时讲一大套高收益路线或毕业改枪，玩家往往还不知道这些建议解决什么问题。</w:t>
-      </w:r>
-    </w:p>
-    <w:p>
-      <w:r>
-        <w:t>首次路线可以选少量容易辨认的位置，提前看清撤离条件。重点不在这一局赚多少，而在于让玩家经历一次完整的前后对应：进图时背包空着，搜索后装入物品，离开后再把物品放进仓库。规则通过结果变得可见。</w:t>
+        <w:t>Starfall 公告把 Operations 的治疗手枪和治疗烟雾的治疗效果持续时间由 20 秒改为 60 秒。它延长了作用时间，但不能据此推导总治疗量提高三倍，更不能外推为现在所有地区的技能参数。</w:t>
       </w:r>
     </w:p>
     <w:p>
@@ -200,17 +1210,12 @@
         <w:pStyle w:val="Heading2"/>
       </w:pPr>
       <w:r>
-        <w:t>回到大厅后再理解物品用途</w:t>
+        <w:t>战后决策仍然有缺口</w:t>
       </w:r>
     </w:p>
     <w:p>
       <w:r>
-        <w:t>带出东西以后，再接触出售、保留材料和任务交付，物品分类才有实际对象。玩家会知道，刚才认为不值钱的材料为什么有人需要，也会发现仓库空间有限，所有东西都留着并不可行。</w:t>
-      </w:r>
-    </w:p>
-    <w:p>
-      <w:r>
-        <w:t>这一阶段适合给出一个明确需求，例如完成某项任务所需的物资。下一次进图就有了搜索方向。若先让玩家背完整物品表，再告诉他可以去地图里寻找，学习负担会大很多，也很难记住。</w:t>
+        <w:t>假设队伍击退对手，却有人弹匣接近空、护甲状态差。即使治疗解决生命值问题，也不应默认其他资源同步恢复。需要先决定是搜尸补给，还是趁敌方增援未到赶快离开。</w:t>
       </w:r>
     </w:p>
     <w:p>
@@ -218,17 +1223,559 @@
         <w:pStyle w:val="Heading2"/>
       </w:pPr>
       <w:r>
-        <w:t>遇到交战问题后理解装备差异</w:t>
+        <w:t>治疗也有位置成本</w:t>
       </w:r>
     </w:p>
     <w:p>
       <w:r>
-        <w:t>能够撤离不等于能够稳定处理交战。接下来需要把命中、弹药、防护、治疗和位置联系起来。一次交火打不赢，可能是枪没打准，也可能是对手的防护、自己的弹药或暴露位置不合适。把这些原因都归结成枪不好用，会让后续花钱改装偏离问题。</w:t>
+        <w:t>聚在一处方便支援，却可能把三个人留在暴露区域。小队若为吃满治疗错过换位时间，账面恢复量会很好看，结果却更差。分析支援贡献时，应把接受治疗后的暴露时间一起看。</w:t>
       </w:r>
     </w:p>
     <w:p>
       <w:r>
-        <w:t>这一阶段的学习重点应该是比较，而不是记结论：保持枪械不变，理解弹药选择的作用；保持装备不变，比较先暴露和先看到对手有什么差别。这样的练习才容易把一个具体结果和一个具体原因联系起来。</w:t>
+        <w:t>图表：同样接受治疗，后续选择可以相反</w:t>
+      </w:r>
+    </w:p>
+    <w:tbl>
+      <w:tblPr>
+        <w:tblW w:type="auto" w:w="0"/>
+        <w:tblLayout w:type="fixed"/>
+        <w:tblLook w:firstColumn="1" w:firstRow="1" w:lastColumn="0" w:lastRow="0" w:noHBand="0" w:noVBand="1" w:val="04A0"/>
+      </w:tblPr>
+      <w:tblGrid>
+        <w:gridCol w:w="3099"/>
+        <w:gridCol w:w="3099"/>
+        <w:gridCol w:w="3099"/>
+      </w:tblGrid>
+      <w:tr>
+        <w:trPr>
+          <w:tblHeader/>
+        </w:trPr>
+        <w:tc>
+          <w:tcPr>
+            <w:tcW w:type="dxa" w:w="3099"/>
+            <w:vAlign w:val="center"/>
+            <w:shd w:fill="3f6f62"/>
+            <w:tcMar>
+              <w:top w:w="100" w:type="dxa"/>
+              <w:left w:w="100" w:type="dxa"/>
+              <w:bottom w:w="100" w:type="dxa"/>
+              <w:right w:w="100" w:type="dxa"/>
+            </w:tcMar>
+          </w:tcPr>
+          <w:p>
+            <w:pPr>
+              <w:spacing w:after="0"/>
+              <w:ind w:firstLine="0"/>
+            </w:pPr>
+            <w:r>
+              <w:rPr>
+                <w:b/>
+                <w:color w:val="FFFFFF"/>
+                <w:sz w:val="17"/>
+              </w:rPr>
+              <w:t>场面条件</w:t>
+            </w:r>
+          </w:p>
+        </w:tc>
+        <w:tc>
+          <w:tcPr>
+            <w:tcW w:type="dxa" w:w="3099"/>
+            <w:vAlign w:val="center"/>
+            <w:shd w:fill="3f6f62"/>
+            <w:tcMar>
+              <w:top w:w="100" w:type="dxa"/>
+              <w:left w:w="100" w:type="dxa"/>
+              <w:bottom w:w="100" w:type="dxa"/>
+              <w:right w:w="100" w:type="dxa"/>
+            </w:tcMar>
+          </w:tcPr>
+          <w:p>
+            <w:pPr>
+              <w:spacing w:after="0"/>
+              <w:ind w:firstLine="0"/>
+            </w:pPr>
+            <w:r>
+              <w:rPr>
+                <w:b/>
+                <w:color w:val="FFFFFF"/>
+                <w:sz w:val="17"/>
+              </w:rPr>
+              <w:t>倾向选择</w:t>
+            </w:r>
+          </w:p>
+        </w:tc>
+        <w:tc>
+          <w:tcPr>
+            <w:tcW w:type="dxa" w:w="3099"/>
+            <w:vAlign w:val="center"/>
+            <w:shd w:fill="3f6f62"/>
+            <w:tcMar>
+              <w:top w:w="100" w:type="dxa"/>
+              <w:left w:w="100" w:type="dxa"/>
+              <w:bottom w:w="100" w:type="dxa"/>
+              <w:right w:w="100" w:type="dxa"/>
+            </w:tcMar>
+          </w:tcPr>
+          <w:p>
+            <w:pPr>
+              <w:spacing w:after="0"/>
+              <w:ind w:firstLine="0"/>
+            </w:pPr>
+            <w:r>
+              <w:rPr>
+                <w:b/>
+                <w:color w:val="FFFFFF"/>
+                <w:sz w:val="17"/>
+              </w:rPr>
+              <w:t>原因</w:t>
+            </w:r>
+          </w:p>
+        </w:tc>
+      </w:tr>
+      <w:tr>
+        <w:tc>
+          <w:tcPr>
+            <w:tcW w:type="dxa" w:w="3099"/>
+            <w:vAlign w:val="center"/>
+            <w:shd w:fill="F5F6F5"/>
+            <w:tcMar>
+              <w:top w:w="100" w:type="dxa"/>
+              <w:left w:w="100" w:type="dxa"/>
+              <w:bottom w:w="100" w:type="dxa"/>
+              <w:right w:w="100" w:type="dxa"/>
+            </w:tcMar>
+          </w:tcPr>
+          <w:p>
+            <w:pPr>
+              <w:spacing w:after="0"/>
+              <w:ind w:firstLine="0"/>
+            </w:pPr>
+            <w:r>
+              <w:rPr>
+                <w:b w:val="0"/>
+                <w:color w:val="222222"/>
+                <w:sz w:val="17"/>
+              </w:rPr>
+              <w:t>安全掩体 / 弹药足</w:t>
+            </w:r>
+          </w:p>
+        </w:tc>
+        <w:tc>
+          <w:tcPr>
+            <w:tcW w:type="dxa" w:w="3099"/>
+            <w:vAlign w:val="center"/>
+            <w:shd w:fill="F5F6F5"/>
+            <w:tcMar>
+              <w:top w:w="100" w:type="dxa"/>
+              <w:left w:w="100" w:type="dxa"/>
+              <w:bottom w:w="100" w:type="dxa"/>
+              <w:right w:w="100" w:type="dxa"/>
+            </w:tcMar>
+          </w:tcPr>
+          <w:p>
+            <w:pPr>
+              <w:spacing w:after="0"/>
+              <w:ind w:firstLine="0"/>
+            </w:pPr>
+            <w:r>
+              <w:rPr>
+                <w:b w:val="0"/>
+                <w:color w:val="222222"/>
+                <w:sz w:val="17"/>
+              </w:rPr>
+              <w:t>恢复后再评估</w:t>
+            </w:r>
+          </w:p>
+        </w:tc>
+        <w:tc>
+          <w:tcPr>
+            <w:tcW w:type="dxa" w:w="3099"/>
+            <w:vAlign w:val="center"/>
+            <w:shd w:fill="F5F6F5"/>
+            <w:tcMar>
+              <w:top w:w="100" w:type="dxa"/>
+              <w:left w:w="100" w:type="dxa"/>
+              <w:bottom w:w="100" w:type="dxa"/>
+              <w:right w:w="100" w:type="dxa"/>
+            </w:tcMar>
+          </w:tcPr>
+          <w:p>
+            <w:pPr>
+              <w:spacing w:after="0"/>
+              <w:ind w:firstLine="0"/>
+            </w:pPr>
+            <w:r>
+              <w:rPr>
+                <w:b w:val="0"/>
+                <w:color w:val="222222"/>
+                <w:sz w:val="17"/>
+              </w:rPr>
+              <w:t>有机会继续行动</w:t>
+            </w:r>
+          </w:p>
+        </w:tc>
+      </w:tr>
+      <w:tr>
+        <w:tc>
+          <w:tcPr>
+            <w:tcW w:type="dxa" w:w="3099"/>
+            <w:vAlign w:val="center"/>
+            <w:shd w:fill="F5F6F5"/>
+            <w:tcMar>
+              <w:top w:w="100" w:type="dxa"/>
+              <w:left w:w="100" w:type="dxa"/>
+              <w:bottom w:w="100" w:type="dxa"/>
+              <w:right w:w="100" w:type="dxa"/>
+            </w:tcMar>
+          </w:tcPr>
+          <w:p>
+            <w:pPr>
+              <w:spacing w:after="0"/>
+              <w:ind w:firstLine="0"/>
+            </w:pPr>
+            <w:r>
+              <w:rPr>
+                <w:b w:val="0"/>
+                <w:color w:val="222222"/>
+                <w:sz w:val="17"/>
+              </w:rPr>
+              <w:t>敌方位置未知</w:t>
+            </w:r>
+          </w:p>
+        </w:tc>
+        <w:tc>
+          <w:tcPr>
+            <w:tcW w:type="dxa" w:w="3099"/>
+            <w:vAlign w:val="center"/>
+            <w:shd w:fill="F5F6F5"/>
+            <w:tcMar>
+              <w:top w:w="100" w:type="dxa"/>
+              <w:left w:w="100" w:type="dxa"/>
+              <w:bottom w:w="100" w:type="dxa"/>
+              <w:right w:w="100" w:type="dxa"/>
+            </w:tcMar>
+          </w:tcPr>
+          <w:p>
+            <w:pPr>
+              <w:spacing w:after="0"/>
+              <w:ind w:firstLine="0"/>
+            </w:pPr>
+            <w:r>
+              <w:rPr>
+                <w:b w:val="0"/>
+                <w:color w:val="222222"/>
+                <w:sz w:val="17"/>
+              </w:rPr>
+              <w:t>先迁移到遮挡处</w:t>
+            </w:r>
+          </w:p>
+        </w:tc>
+        <w:tc>
+          <w:tcPr>
+            <w:tcW w:type="dxa" w:w="3099"/>
+            <w:vAlign w:val="center"/>
+            <w:shd w:fill="F5F6F5"/>
+            <w:tcMar>
+              <w:top w:w="100" w:type="dxa"/>
+              <w:left w:w="100" w:type="dxa"/>
+              <w:bottom w:w="100" w:type="dxa"/>
+              <w:right w:w="100" w:type="dxa"/>
+            </w:tcMar>
+          </w:tcPr>
+          <w:p>
+            <w:pPr>
+              <w:spacing w:after="0"/>
+              <w:ind w:firstLine="0"/>
+            </w:pPr>
+            <w:r>
+              <w:rPr>
+                <w:b w:val="0"/>
+                <w:color w:val="222222"/>
+                <w:sz w:val="17"/>
+              </w:rPr>
+              <w:t>避免停留换来新受击</w:t>
+            </w:r>
+          </w:p>
+        </w:tc>
+      </w:tr>
+      <w:tr>
+        <w:tc>
+          <w:tcPr>
+            <w:tcW w:type="dxa" w:w="3099"/>
+            <w:vAlign w:val="center"/>
+            <w:shd w:fill="F5F6F5"/>
+            <w:tcMar>
+              <w:top w:w="100" w:type="dxa"/>
+              <w:left w:w="100" w:type="dxa"/>
+              <w:bottom w:w="100" w:type="dxa"/>
+              <w:right w:w="100" w:type="dxa"/>
+            </w:tcMar>
+          </w:tcPr>
+          <w:p>
+            <w:pPr>
+              <w:spacing w:after="0"/>
+              <w:ind w:firstLine="0"/>
+            </w:pPr>
+            <w:r>
+              <w:rPr>
+                <w:b w:val="0"/>
+                <w:color w:val="222222"/>
+                <w:sz w:val="17"/>
+              </w:rPr>
+              <w:t>护甲或弹药不足</w:t>
+            </w:r>
+          </w:p>
+        </w:tc>
+        <w:tc>
+          <w:tcPr>
+            <w:tcW w:type="dxa" w:w="3099"/>
+            <w:vAlign w:val="center"/>
+            <w:shd w:fill="F5F6F5"/>
+            <w:tcMar>
+              <w:top w:w="100" w:type="dxa"/>
+              <w:left w:w="100" w:type="dxa"/>
+              <w:bottom w:w="100" w:type="dxa"/>
+              <w:right w:w="100" w:type="dxa"/>
+            </w:tcMar>
+          </w:tcPr>
+          <w:p>
+            <w:pPr>
+              <w:spacing w:after="0"/>
+              <w:ind w:firstLine="0"/>
+            </w:pPr>
+            <w:r>
+              <w:rPr>
+                <w:b w:val="0"/>
+                <w:color w:val="222222"/>
+                <w:sz w:val="17"/>
+              </w:rPr>
+              <w:t>补给或撤离</w:t>
+            </w:r>
+          </w:p>
+        </w:tc>
+        <w:tc>
+          <w:tcPr>
+            <w:tcW w:type="dxa" w:w="3099"/>
+            <w:vAlign w:val="center"/>
+            <w:shd w:fill="F5F6F5"/>
+            <w:tcMar>
+              <w:top w:w="100" w:type="dxa"/>
+              <w:left w:w="100" w:type="dxa"/>
+              <w:bottom w:w="100" w:type="dxa"/>
+              <w:right w:w="100" w:type="dxa"/>
+            </w:tcMar>
+          </w:tcPr>
+          <w:p>
+            <w:pPr>
+              <w:spacing w:after="0"/>
+              <w:ind w:firstLine="0"/>
+            </w:pPr>
+            <w:r>
+              <w:rPr>
+                <w:b w:val="0"/>
+                <w:color w:val="222222"/>
+                <w:sz w:val="17"/>
+              </w:rPr>
+              <w:t>治疗没有解决全部缺口</w:t>
+            </w:r>
+          </w:p>
+        </w:tc>
+      </w:tr>
+      <w:tr>
+        <w:tc>
+          <w:tcPr>
+            <w:tcW w:type="dxa" w:w="3099"/>
+            <w:vAlign w:val="center"/>
+            <w:shd w:fill="F5F6F5"/>
+            <w:tcMar>
+              <w:top w:w="100" w:type="dxa"/>
+              <w:left w:w="100" w:type="dxa"/>
+              <w:bottom w:w="100" w:type="dxa"/>
+              <w:right w:w="100" w:type="dxa"/>
+            </w:tcMar>
+          </w:tcPr>
+          <w:p>
+            <w:pPr>
+              <w:spacing w:after="0"/>
+              <w:ind w:firstLine="0"/>
+            </w:pPr>
+            <w:r>
+              <w:rPr>
+                <w:b w:val="0"/>
+                <w:color w:val="222222"/>
+                <w:sz w:val="17"/>
+              </w:rPr>
+              <w:t>撤离窗口紧迫</w:t>
+            </w:r>
+          </w:p>
+        </w:tc>
+        <w:tc>
+          <w:tcPr>
+            <w:tcW w:type="dxa" w:w="3099"/>
+            <w:vAlign w:val="center"/>
+            <w:shd w:fill="F5F6F5"/>
+            <w:tcMar>
+              <w:top w:w="100" w:type="dxa"/>
+              <w:left w:w="100" w:type="dxa"/>
+              <w:bottom w:w="100" w:type="dxa"/>
+              <w:right w:w="100" w:type="dxa"/>
+            </w:tcMar>
+          </w:tcPr>
+          <w:p>
+            <w:pPr>
+              <w:spacing w:after="0"/>
+              <w:ind w:firstLine="0"/>
+            </w:pPr>
+            <w:r>
+              <w:rPr>
+                <w:b w:val="0"/>
+                <w:color w:val="222222"/>
+                <w:sz w:val="17"/>
+              </w:rPr>
+              <w:t>够用就走</w:t>
+            </w:r>
+          </w:p>
+        </w:tc>
+        <w:tc>
+          <w:tcPr>
+            <w:tcW w:type="dxa" w:w="3099"/>
+            <w:vAlign w:val="center"/>
+            <w:shd w:fill="F5F6F5"/>
+            <w:tcMar>
+              <w:top w:w="100" w:type="dxa"/>
+              <w:left w:w="100" w:type="dxa"/>
+              <w:bottom w:w="100" w:type="dxa"/>
+              <w:right w:w="100" w:type="dxa"/>
+            </w:tcMar>
+          </w:tcPr>
+          <w:p>
+            <w:pPr>
+              <w:spacing w:after="0"/>
+              <w:ind w:firstLine="0"/>
+            </w:pPr>
+            <w:r>
+              <w:rPr>
+                <w:b w:val="0"/>
+                <w:color w:val="222222"/>
+                <w:sz w:val="17"/>
+              </w:rPr>
+              <w:t>多停留的成本高于额外恢复</w:t>
+            </w:r>
+          </w:p>
+        </w:tc>
+      </w:tr>
+      <w:tr>
+        <w:tc>
+          <w:tcPr>
+            <w:tcW w:type="dxa" w:w="3099"/>
+            <w:vAlign w:val="center"/>
+            <w:shd w:fill="F5F6F5"/>
+            <w:tcMar>
+              <w:top w:w="100" w:type="dxa"/>
+              <w:left w:w="100" w:type="dxa"/>
+              <w:bottom w:w="100" w:type="dxa"/>
+              <w:right w:w="100" w:type="dxa"/>
+            </w:tcMar>
+          </w:tcPr>
+          <w:p>
+            <w:pPr>
+              <w:spacing w:after="0"/>
+              <w:ind w:firstLine="0"/>
+            </w:pPr>
+            <w:r>
+              <w:rPr>
+                <w:b w:val="0"/>
+                <w:color w:val="222222"/>
+                <w:sz w:val="17"/>
+              </w:rPr>
+              <w:t>队友分散</w:t>
+            </w:r>
+          </w:p>
+        </w:tc>
+        <w:tc>
+          <w:tcPr>
+            <w:tcW w:type="dxa" w:w="3099"/>
+            <w:vAlign w:val="center"/>
+            <w:shd w:fill="F5F6F5"/>
+            <w:tcMar>
+              <w:top w:w="100" w:type="dxa"/>
+              <w:left w:w="100" w:type="dxa"/>
+              <w:bottom w:w="100" w:type="dxa"/>
+              <w:right w:w="100" w:type="dxa"/>
+            </w:tcMar>
+          </w:tcPr>
+          <w:p>
+            <w:pPr>
+              <w:spacing w:after="0"/>
+              <w:ind w:firstLine="0"/>
+            </w:pPr>
+            <w:r>
+              <w:rPr>
+                <w:b w:val="0"/>
+                <w:color w:val="222222"/>
+                <w:sz w:val="17"/>
+              </w:rPr>
+              <w:t>先协调集合位置</w:t>
+            </w:r>
+          </w:p>
+        </w:tc>
+        <w:tc>
+          <w:tcPr>
+            <w:tcW w:type="dxa" w:w="3099"/>
+            <w:vAlign w:val="center"/>
+            <w:shd w:fill="F5F6F5"/>
+            <w:tcMar>
+              <w:top w:w="100" w:type="dxa"/>
+              <w:left w:w="100" w:type="dxa"/>
+              <w:bottom w:w="100" w:type="dxa"/>
+              <w:right w:w="100" w:type="dxa"/>
+            </w:tcMar>
+          </w:tcPr>
+          <w:p>
+            <w:pPr>
+              <w:spacing w:after="0"/>
+              <w:ind w:firstLine="0"/>
+            </w:pPr>
+            <w:r>
+              <w:rPr>
+                <w:b w:val="0"/>
+                <w:color w:val="222222"/>
+                <w:sz w:val="17"/>
+              </w:rPr>
+              <w:t>治疗可达性本身有要求</w:t>
+            </w:r>
+          </w:p>
+        </w:tc>
+      </w:tr>
+    </w:tbl>
+    <w:p/>
+    <w:p>
+      <w:r>
+        <w:t>更值得问的是“治疗是否让队友完成了原本做不到的移动或接战”，而不是把治疗量直接当作最终贡献。</w:t>
+      </w:r>
+    </w:p>
+    <w:p>
+      <w:pPr>
+        <w:spacing w:line="264" w:lineRule="auto"/>
+        <w:ind w:firstLine="0"/>
+        <w:jc w:val="center"/>
+      </w:pPr>
+      <w:r>
+        <w:t>来源：D2</w:t>
+      </w:r>
+    </w:p>
+    <w:p>
+      <w:pPr>
+        <w:pStyle w:val="Heading1"/>
+      </w:pPr>
+      <w:r>
+        <w:t>10 红狼：第一次击倒改变后续推进成本</w:t>
+      </w:r>
+    </w:p>
+    <w:p>
+      <w:r>
+        <w:t>红狼适合用来观察正反馈。首个成功可以改善下一次接战条件，但它也容易诱使使用者追过安全边界。</w:t>
       </w:r>
     </w:p>
     <w:p>
@@ -236,17 +1783,90 @@
         <w:pStyle w:val="Heading2"/>
       </w:pPr>
       <w:r>
-        <w:t>有了固定目标以后再做长期积累</w:t>
+        <w:t>技能组的衔接</w:t>
       </w:r>
     </w:p>
     <w:p>
       <w:r>
-        <w:t>当玩家愿意反复进入某张地图，任务、特勤处与装备储备才开始有较清楚的位置。他可以为了材料改一段搜索路线，也可以为了练习交战，专门准备能承担损失的装备。局外成长不再只是看着几个数值上涨，而是支持某种自己想做的事情。</w:t>
+        <w:t>官方基础介绍中，动力外骨骼提供短时移动和射速提升；击倒敌人可恢复生命与体力并延长状态。烟雾和滑铲为突破提供操作手段。这里关注条件反馈，不引用具体加成比例。</w:t>
+      </w:r>
+    </w:p>
+    <w:p>
+      <w:pPr>
+        <w:pStyle w:val="Heading2"/>
+      </w:pPr>
+      <w:r>
+        <w:t>为什么会越打越想追</w:t>
       </w:r>
     </w:p>
     <w:p>
       <w:r>
-        <w:t>干员配合也适合在这个阶段继续深化。先熟悉一个干员怎样保护自己，再理解同一技能什么时候能帮队友。烟幕什么时候封、侦察结果什么时候报、倒地后谁看住对手，都需要和小队的行动接上。提前背一套阵容名称，并不能代替这些配合。</w:t>
+        <w:t>第一次击倒后，剩余技能时间与状态得到补充，继续压迫看起来更划算。但被击倒的只是一个目标，第二名敌人的枪线并未自动消失。技能奖励的局部成功，可能与小队的撤离目标产生冲突。</w:t>
+      </w:r>
+    </w:p>
+    <w:p>
+      <w:pPr>
+        <w:pStyle w:val="Heading2"/>
+      </w:pPr>
+      <w:r>
+        <w:t>评价时要拆开两个问题</w:t>
+      </w:r>
+    </w:p>
+    <w:p>
+      <w:r>
+        <w:t>先看爆发窗口是否让突破发生，再看击倒后的恢复是否让推进过于连续。若问题出在第二段，一起削弱启动能力会损伤干员最清楚的用途。优先定位触发条件、延长收益及重新接战间隔，才能知道该调哪一段。</w:t>
+      </w:r>
+    </w:p>
+    <w:p>
+      <w:r>
+        <w:t>图表：正反馈与退出条件</w:t>
+      </w:r>
+    </w:p>
+    <w:p>
+      <w:pPr>
+        <w:ind w:firstLine="0" w:left="397"/>
+      </w:pPr>
+      <w:r>
+        <w:t>1. 开启外骨骼：承担接近目标的风险</w:t>
+      </w:r>
+    </w:p>
+    <w:p>
+      <w:pPr>
+        <w:ind w:firstLine="0" w:left="397"/>
+      </w:pPr>
+      <w:r>
+        <w:t>2. 取得第一次击倒：恢复与延长，提高继续行动吸引力</w:t>
+      </w:r>
+    </w:p>
+    <w:p>
+      <w:pPr>
+        <w:ind w:firstLine="0" w:left="397"/>
+      </w:pPr>
+      <w:r>
+        <w:t>3. 重新检查局面：队友距离、第二条枪线、撤离收益</w:t>
+      </w:r>
+    </w:p>
+    <w:p>
+      <w:pPr>
+        <w:ind w:firstLine="0" w:left="397"/>
+      </w:pPr>
+      <w:r>
+        <w:t>4. 继续或停止：有支援才压；状态奖励不能代替判断</w:t>
+      </w:r>
+    </w:p>
+    <w:p>
+      <w:r>
+        <w:t>评价滚雪球机制时，要看成功奖励有没有抹掉下一次风险，而非只看一次技能造成多少伤害。</w:t>
+      </w:r>
+    </w:p>
+    <w:p>
+      <w:pPr>
+        <w:spacing w:line="264" w:lineRule="auto"/>
+        <w:ind w:firstLine="0"/>
+        <w:jc w:val="center"/>
+      </w:pPr>
+      <w:r>
+        <w:t>来源：D1</w:t>
       </w:r>
     </w:p>
     <w:p>
@@ -254,7 +1874,12 @@
         <w:pStyle w:val="Heading1"/>
       </w:pPr>
       <w:r>
-        <w:t>三 核心玩法</w:t>
+        <w:t>11 牧羊人：让对手有机会识别陷阱，是平衡的一部分</w:t>
+      </w:r>
+    </w:p>
+    <w:p>
+      <w:r>
+        <w:t>部署物即使没有完成击杀，也可能通过迫使敌人停步、绕行或处理装置，给撤离方争取距离。</w:t>
       </w:r>
     </w:p>
     <w:p>
@@ -262,32 +1887,12 @@
         <w:pStyle w:val="Heading2"/>
       </w:pPr>
       <w:r>
-        <w:t>搜到东西以后 为什么会想换一条路</w:t>
+        <w:t>可核对的历史案例</w:t>
       </w:r>
     </w:p>
     <w:p>
       <w:r>
-        <w:t>假设一支小队原本准备去资源区。途中有人拿到当前急需的任务物资，又占用了安全箱以外的背包空间；前方这时传来枪声。继续前进可以争取更多收益，也可能丢掉已经拿到的东西。绕路撤离则会放弃原计划。这个假设局面可以用来说明选择如何变化。</w:t>
-      </w:r>
-    </w:p>
-    <w:p>
-      <w:r>
-        <w:t>物资获得之前，去资源区解决的是缺少收益的问题；物资获得以后，玩家还得解决怎样保住这次成果的问题。目标没有被系统强行切换，玩家却有理由主动改变路线。一次随机搜获就能改变后半局的打法，这比单纯增加一种容器更值得关注。</w:t>
-      </w:r>
-    </w:p>
-    <w:p>
-      <w:r>
-        <w:t>不过，不能把它简化成背包越贵就越该撤。还要看东西能否放进安全箱，是否需要成功带出，队友的目标是什么，以及眼前是否有安全路线。已经满足安全箱保护条件的物品，和仍然暴露在失败损失中的物品，对接战意愿的影响不一样。[1]</w:t>
-      </w:r>
-    </w:p>
-    <w:p>
-      <w:r>
-        <w:t>三个人的想法也未必同步。一个人已经拿到所需材料，另一个人可能还想完成击败目标的任务。小队需要商量继续还是离开。这个分歧让撤离决策有社交内容，同时也可能带来摩擦。只用全队背包总价值解释选择，会漏掉队员各自的目的。</w:t>
-      </w:r>
-    </w:p>
-    <w:p>
-      <w:r>
-        <w:t>我更认可把这种目标变化保留下来。地图若总能按同一条安全路线拿到相似收益，玩家就容易照着路线跑，途中得到什么都不影响决策。相反，如果所有好东西都逼着人去最拥挤的交火区，回避战斗又会失去可行性。两端都压缩了玩家自己选择的空间。</w:t>
+        <w:t>2025 年 7 月的 Garena 公告将声波陷阱最大声音传播距离从 7 米改为 8 米。官方说明强调更清楚的警告与反制，同时保留防守用途。这是提示信息的调整，不是单纯削伤害。</w:t>
       </w:r>
     </w:p>
     <w:p>
@@ -295,27 +1900,12 @@
         <w:pStyle w:val="Heading2"/>
       </w:pPr>
       <w:r>
-        <w:t>打赢一队以后 为什么还不能放松</w:t>
+        <w:t>为什么反制不会让它失去意义</w:t>
       </w:r>
     </w:p>
     <w:p>
       <w:r>
-        <w:t>烽火地带的一场交火会留下后续问题。小队可能需要治疗、补充弹药、救援队友；敌人的战利品又需要靠近检查。刚才的枪声可能吸引别的小队，当前人数和剩余状态却不再适合马上打一场同样强度的战斗。</w:t>
-      </w:r>
-    </w:p>
-    <w:p>
-      <w:r>
-        <w:t>于是，击败对手和拿走对手的东西之间，还隔着一段需要处理的过程。谁先补状态，谁观察周围，要不要把全部物品搜完，都影响这一战最后有没有产生收益。若所有队员同时打开背包，小队虽然在上一轮对枪中赢了，却把下一次接敌的准备丢掉了。</w:t>
-      </w:r>
-    </w:p>
-    <w:p>
-      <w:r>
-        <w:t>干员技能在这里有了不同于开团的用途。烟幕可以辅助转移或救援，侦察可以补充附近的信息，防守装置可以照看一条通道。但它们只能改善一部分条件。烟幕遮住视线，也让己方更难看清烟内外的活动；侦察反馈需要结合范围和时机理解；装置覆盖的方向以外仍然可能来人。</w:t>
-      </w:r>
-    </w:p>
-    <w:p>
-      <w:r>
-        <w:t>这也是我认为干员分析应放回完整对局的原因。如果只比较正面遭遇时谁更容易击倒对手，治疗、掩护和暂时守住侧后的价值很容易被低估。另一方面，支援技能若能在每场交火后轻易抹掉状态损失，前一场战斗付出的代价又会变轻。支援强度与连续接战的频率应当一起看。</w:t>
+        <w:t>追击方听到提示后可以减速处理，也可以改走另一边。只要这改变了追击节奏，防守方仍可能获益。反之，若装置没有提示、又让人难以应对，受害者就很难从失败中学到下一次该怎样处理。</w:t>
       </w:r>
     </w:p>
     <w:p>
@@ -323,27 +1913,559 @@
         <w:pStyle w:val="Heading2"/>
       </w:pPr>
       <w:r>
-        <w:t>装备积累让人想再开一局 也可能让人不敢出门</w:t>
+        <w:t>不能把绕路时间写成硬控制</w:t>
       </w:r>
     </w:p>
     <w:p>
       <w:r>
-        <w:t>撤离所得能转成装备、物资和后续准备，玩家可以感受到上一局留下的东西。比起每次重新发同一套武器，这种连续性更容易形成个人目标：攒一套装备、补齐制造材料，或者留几套低成本配置专门练图。</w:t>
+        <w:t>地图若有很近的平行入口，对手可以几乎不付代价地绕过。陷阱的价值因此取决于部署点与路线结构。没有录像和路径记录，不能把一次“敌人没有追上”都归因于部署物。</w:t>
       </w:r>
     </w:p>
     <w:p>
       <w:r>
-        <w:t>但连续性同时意味着亏损也会留下。玩家把装备看得越重，越可能不愿意承担试错。最终出现一种矛盾：积累本来是为了获得更多行动选择，实际却可能变成只愿意用最便宜的装备，最好的东西一直放在仓库里。</w:t>
+        <w:t>图表：反制链：任何一段断掉都影响体验</w:t>
+      </w:r>
+    </w:p>
+    <w:tbl>
+      <w:tblPr>
+        <w:tblW w:type="auto" w:w="0"/>
+        <w:tblLayout w:type="fixed"/>
+        <w:tblLook w:firstColumn="1" w:firstRow="1" w:lastColumn="0" w:lastRow="0" w:noHBand="0" w:noVBand="1" w:val="04A0"/>
+      </w:tblPr>
+      <w:tblGrid>
+        <w:gridCol w:w="3099"/>
+        <w:gridCol w:w="3099"/>
+        <w:gridCol w:w="3099"/>
+      </w:tblGrid>
+      <w:tr>
+        <w:trPr>
+          <w:tblHeader/>
+        </w:trPr>
+        <w:tc>
+          <w:tcPr>
+            <w:tcW w:type="dxa" w:w="3099"/>
+            <w:vAlign w:val="center"/>
+            <w:shd w:fill="3f6f62"/>
+            <w:tcMar>
+              <w:top w:w="100" w:type="dxa"/>
+              <w:left w:w="100" w:type="dxa"/>
+              <w:bottom w:w="100" w:type="dxa"/>
+              <w:right w:w="100" w:type="dxa"/>
+            </w:tcMar>
+          </w:tcPr>
+          <w:p>
+            <w:pPr>
+              <w:spacing w:after="0"/>
+              <w:ind w:firstLine="0"/>
+            </w:pPr>
+            <w:r>
+              <w:rPr>
+                <w:b/>
+                <w:color w:val="FFFFFF"/>
+                <w:sz w:val="17"/>
+              </w:rPr>
+              <w:t>环节</w:t>
+            </w:r>
+          </w:p>
+        </w:tc>
+        <w:tc>
+          <w:tcPr>
+            <w:tcW w:type="dxa" w:w="3099"/>
+            <w:vAlign w:val="center"/>
+            <w:shd w:fill="3f6f62"/>
+            <w:tcMar>
+              <w:top w:w="100" w:type="dxa"/>
+              <w:left w:w="100" w:type="dxa"/>
+              <w:bottom w:w="100" w:type="dxa"/>
+              <w:right w:w="100" w:type="dxa"/>
+            </w:tcMar>
+          </w:tcPr>
+          <w:p>
+            <w:pPr>
+              <w:spacing w:after="0"/>
+              <w:ind w:firstLine="0"/>
+            </w:pPr>
+            <w:r>
+              <w:rPr>
+                <w:b/>
+                <w:color w:val="FFFFFF"/>
+                <w:sz w:val="17"/>
+              </w:rPr>
+              <w:t>使用方想要什么</w:t>
+            </w:r>
+          </w:p>
+        </w:tc>
+        <w:tc>
+          <w:tcPr>
+            <w:tcW w:type="dxa" w:w="3099"/>
+            <w:vAlign w:val="center"/>
+            <w:shd w:fill="3f6f62"/>
+            <w:tcMar>
+              <w:top w:w="100" w:type="dxa"/>
+              <w:left w:w="100" w:type="dxa"/>
+              <w:bottom w:w="100" w:type="dxa"/>
+              <w:right w:w="100" w:type="dxa"/>
+            </w:tcMar>
+          </w:tcPr>
+          <w:p>
+            <w:pPr>
+              <w:spacing w:after="0"/>
+              <w:ind w:firstLine="0"/>
+            </w:pPr>
+            <w:r>
+              <w:rPr>
+                <w:b/>
+                <w:color w:val="FFFFFF"/>
+                <w:sz w:val="17"/>
+              </w:rPr>
+              <w:t>对抗方需要什么</w:t>
+            </w:r>
+          </w:p>
+        </w:tc>
+      </w:tr>
+      <w:tr>
+        <w:tc>
+          <w:tcPr>
+            <w:tcW w:type="dxa" w:w="3099"/>
+            <w:vAlign w:val="center"/>
+            <w:shd w:fill="F5F6F5"/>
+            <w:tcMar>
+              <w:top w:w="100" w:type="dxa"/>
+              <w:left w:w="100" w:type="dxa"/>
+              <w:bottom w:w="100" w:type="dxa"/>
+              <w:right w:w="100" w:type="dxa"/>
+            </w:tcMar>
+          </w:tcPr>
+          <w:p>
+            <w:pPr>
+              <w:spacing w:after="0"/>
+              <w:ind w:firstLine="0"/>
+            </w:pPr>
+            <w:r>
+              <w:rPr>
+                <w:b w:val="0"/>
+                <w:color w:val="222222"/>
+                <w:sz w:val="17"/>
+              </w:rPr>
+              <w:t>发现</w:t>
+            </w:r>
+          </w:p>
+        </w:tc>
+        <w:tc>
+          <w:tcPr>
+            <w:tcW w:type="dxa" w:w="3099"/>
+            <w:vAlign w:val="center"/>
+            <w:shd w:fill="F5F6F5"/>
+            <w:tcMar>
+              <w:top w:w="100" w:type="dxa"/>
+              <w:left w:w="100" w:type="dxa"/>
+              <w:bottom w:w="100" w:type="dxa"/>
+              <w:right w:w="100" w:type="dxa"/>
+            </w:tcMar>
+          </w:tcPr>
+          <w:p>
+            <w:pPr>
+              <w:spacing w:after="0"/>
+              <w:ind w:firstLine="0"/>
+            </w:pPr>
+            <w:r>
+              <w:rPr>
+                <w:b w:val="0"/>
+                <w:color w:val="222222"/>
+                <w:sz w:val="17"/>
+              </w:rPr>
+              <w:t>保持部署隐蔽性</w:t>
+            </w:r>
+          </w:p>
+        </w:tc>
+        <w:tc>
+          <w:tcPr>
+            <w:tcW w:type="dxa" w:w="3099"/>
+            <w:vAlign w:val="center"/>
+            <w:shd w:fill="F5F6F5"/>
+            <w:tcMar>
+              <w:top w:w="100" w:type="dxa"/>
+              <w:left w:w="100" w:type="dxa"/>
+              <w:bottom w:w="100" w:type="dxa"/>
+              <w:right w:w="100" w:type="dxa"/>
+            </w:tcMar>
+          </w:tcPr>
+          <w:p>
+            <w:pPr>
+              <w:spacing w:after="0"/>
+              <w:ind w:firstLine="0"/>
+            </w:pPr>
+            <w:r>
+              <w:rPr>
+                <w:b w:val="0"/>
+                <w:color w:val="222222"/>
+                <w:sz w:val="17"/>
+              </w:rPr>
+              <w:t>在受罚前有可识别提示</w:t>
+            </w:r>
+          </w:p>
+        </w:tc>
+      </w:tr>
+      <w:tr>
+        <w:tc>
+          <w:tcPr>
+            <w:tcW w:type="dxa" w:w="3099"/>
+            <w:vAlign w:val="center"/>
+            <w:shd w:fill="F5F6F5"/>
+            <w:tcMar>
+              <w:top w:w="100" w:type="dxa"/>
+              <w:left w:w="100" w:type="dxa"/>
+              <w:bottom w:w="100" w:type="dxa"/>
+              <w:right w:w="100" w:type="dxa"/>
+            </w:tcMar>
+          </w:tcPr>
+          <w:p>
+            <w:pPr>
+              <w:spacing w:after="0"/>
+              <w:ind w:firstLine="0"/>
+            </w:pPr>
+            <w:r>
+              <w:rPr>
+                <w:b w:val="0"/>
+                <w:color w:val="222222"/>
+                <w:sz w:val="17"/>
+              </w:rPr>
+              <w:t>判断</w:t>
+            </w:r>
+          </w:p>
+        </w:tc>
+        <w:tc>
+          <w:tcPr>
+            <w:tcW w:type="dxa" w:w="3099"/>
+            <w:vAlign w:val="center"/>
+            <w:shd w:fill="F5F6F5"/>
+            <w:tcMar>
+              <w:top w:w="100" w:type="dxa"/>
+              <w:left w:w="100" w:type="dxa"/>
+              <w:bottom w:w="100" w:type="dxa"/>
+              <w:right w:w="100" w:type="dxa"/>
+            </w:tcMar>
+          </w:tcPr>
+          <w:p>
+            <w:pPr>
+              <w:spacing w:after="0"/>
+              <w:ind w:firstLine="0"/>
+            </w:pPr>
+            <w:r>
+              <w:rPr>
+                <w:b w:val="0"/>
+                <w:color w:val="222222"/>
+                <w:sz w:val="17"/>
+              </w:rPr>
+              <w:t>让敌人犹豫</w:t>
+            </w:r>
+          </w:p>
+        </w:tc>
+        <w:tc>
+          <w:tcPr>
+            <w:tcW w:type="dxa" w:w="3099"/>
+            <w:vAlign w:val="center"/>
+            <w:shd w:fill="F5F6F5"/>
+            <w:tcMar>
+              <w:top w:w="100" w:type="dxa"/>
+              <w:left w:w="100" w:type="dxa"/>
+              <w:bottom w:w="100" w:type="dxa"/>
+              <w:right w:w="100" w:type="dxa"/>
+            </w:tcMar>
+          </w:tcPr>
+          <w:p>
+            <w:pPr>
+              <w:spacing w:after="0"/>
+              <w:ind w:firstLine="0"/>
+            </w:pPr>
+            <w:r>
+              <w:rPr>
+                <w:b w:val="0"/>
+                <w:color w:val="222222"/>
+                <w:sz w:val="17"/>
+              </w:rPr>
+              <w:t>知道大致威胁来自哪里</w:t>
+            </w:r>
+          </w:p>
+        </w:tc>
+      </w:tr>
+      <w:tr>
+        <w:tc>
+          <w:tcPr>
+            <w:tcW w:type="dxa" w:w="3099"/>
+            <w:vAlign w:val="center"/>
+            <w:shd w:fill="F5F6F5"/>
+            <w:tcMar>
+              <w:top w:w="100" w:type="dxa"/>
+              <w:left w:w="100" w:type="dxa"/>
+              <w:bottom w:w="100" w:type="dxa"/>
+              <w:right w:w="100" w:type="dxa"/>
+            </w:tcMar>
+          </w:tcPr>
+          <w:p>
+            <w:pPr>
+              <w:spacing w:after="0"/>
+              <w:ind w:firstLine="0"/>
+            </w:pPr>
+            <w:r>
+              <w:rPr>
+                <w:b w:val="0"/>
+                <w:color w:val="222222"/>
+                <w:sz w:val="17"/>
+              </w:rPr>
+              <w:t>行动</w:t>
+            </w:r>
+          </w:p>
+        </w:tc>
+        <w:tc>
+          <w:tcPr>
+            <w:tcW w:type="dxa" w:w="3099"/>
+            <w:vAlign w:val="center"/>
+            <w:shd w:fill="F5F6F5"/>
+            <w:tcMar>
+              <w:top w:w="100" w:type="dxa"/>
+              <w:left w:w="100" w:type="dxa"/>
+              <w:bottom w:w="100" w:type="dxa"/>
+              <w:right w:w="100" w:type="dxa"/>
+            </w:tcMar>
+          </w:tcPr>
+          <w:p>
+            <w:pPr>
+              <w:spacing w:after="0"/>
+              <w:ind w:firstLine="0"/>
+            </w:pPr>
+            <w:r>
+              <w:rPr>
+                <w:b w:val="0"/>
+                <w:color w:val="222222"/>
+                <w:sz w:val="17"/>
+              </w:rPr>
+              <w:t>拖慢通过速度</w:t>
+            </w:r>
+          </w:p>
+        </w:tc>
+        <w:tc>
+          <w:tcPr>
+            <w:tcW w:type="dxa" w:w="3099"/>
+            <w:vAlign w:val="center"/>
+            <w:shd w:fill="F5F6F5"/>
+            <w:tcMar>
+              <w:top w:w="100" w:type="dxa"/>
+              <w:left w:w="100" w:type="dxa"/>
+              <w:bottom w:w="100" w:type="dxa"/>
+              <w:right w:w="100" w:type="dxa"/>
+            </w:tcMar>
+          </w:tcPr>
+          <w:p>
+            <w:pPr>
+              <w:spacing w:after="0"/>
+              <w:ind w:firstLine="0"/>
+            </w:pPr>
+            <w:r>
+              <w:rPr>
+                <w:b w:val="0"/>
+                <w:color w:val="222222"/>
+                <w:sz w:val="17"/>
+              </w:rPr>
+              <w:t>能处理、等待或换路线</w:t>
+            </w:r>
+          </w:p>
+        </w:tc>
+      </w:tr>
+      <w:tr>
+        <w:tc>
+          <w:tcPr>
+            <w:tcW w:type="dxa" w:w="3099"/>
+            <w:vAlign w:val="center"/>
+            <w:shd w:fill="F5F6F5"/>
+            <w:tcMar>
+              <w:top w:w="100" w:type="dxa"/>
+              <w:left w:w="100" w:type="dxa"/>
+              <w:bottom w:w="100" w:type="dxa"/>
+              <w:right w:w="100" w:type="dxa"/>
+            </w:tcMar>
+          </w:tcPr>
+          <w:p>
+            <w:pPr>
+              <w:spacing w:after="0"/>
+              <w:ind w:firstLine="0"/>
+            </w:pPr>
+            <w:r>
+              <w:rPr>
+                <w:b w:val="0"/>
+                <w:color w:val="222222"/>
+                <w:sz w:val="17"/>
+              </w:rPr>
+              <w:t>结果</w:t>
+            </w:r>
+          </w:p>
+        </w:tc>
+        <w:tc>
+          <w:tcPr>
+            <w:tcW w:type="dxa" w:w="3099"/>
+            <w:vAlign w:val="center"/>
+            <w:shd w:fill="F5F6F5"/>
+            <w:tcMar>
+              <w:top w:w="100" w:type="dxa"/>
+              <w:left w:w="100" w:type="dxa"/>
+              <w:bottom w:w="100" w:type="dxa"/>
+              <w:right w:w="100" w:type="dxa"/>
+            </w:tcMar>
+          </w:tcPr>
+          <w:p>
+            <w:pPr>
+              <w:spacing w:after="0"/>
+              <w:ind w:firstLine="0"/>
+            </w:pPr>
+            <w:r>
+              <w:rPr>
+                <w:b w:val="0"/>
+                <w:color w:val="222222"/>
+                <w:sz w:val="17"/>
+              </w:rPr>
+              <w:t>拉开距离或守住入口</w:t>
+            </w:r>
+          </w:p>
+        </w:tc>
+        <w:tc>
+          <w:tcPr>
+            <w:tcW w:type="dxa" w:w="3099"/>
+            <w:vAlign w:val="center"/>
+            <w:shd w:fill="F5F6F5"/>
+            <w:tcMar>
+              <w:top w:w="100" w:type="dxa"/>
+              <w:left w:w="100" w:type="dxa"/>
+              <w:bottom w:w="100" w:type="dxa"/>
+              <w:right w:w="100" w:type="dxa"/>
+            </w:tcMar>
+          </w:tcPr>
+          <w:p>
+            <w:pPr>
+              <w:spacing w:after="0"/>
+              <w:ind w:firstLine="0"/>
+            </w:pPr>
+            <w:r>
+              <w:rPr>
+                <w:b w:val="0"/>
+                <w:color w:val="222222"/>
+                <w:sz w:val="17"/>
+              </w:rPr>
+              <w:t>理解为什么通过成功或失败</w:t>
+            </w:r>
+          </w:p>
+        </w:tc>
+      </w:tr>
+      <w:tr>
+        <w:tc>
+          <w:tcPr>
+            <w:tcW w:type="dxa" w:w="3099"/>
+            <w:vAlign w:val="center"/>
+            <w:shd w:fill="F5F6F5"/>
+            <w:tcMar>
+              <w:top w:w="100" w:type="dxa"/>
+              <w:left w:w="100" w:type="dxa"/>
+              <w:bottom w:w="100" w:type="dxa"/>
+              <w:right w:w="100" w:type="dxa"/>
+            </w:tcMar>
+          </w:tcPr>
+          <w:p>
+            <w:pPr>
+              <w:spacing w:after="0"/>
+              <w:ind w:firstLine="0"/>
+            </w:pPr>
+            <w:r>
+              <w:rPr>
+                <w:b w:val="0"/>
+                <w:color w:val="222222"/>
+                <w:sz w:val="17"/>
+              </w:rPr>
+              <w:t>复盘</w:t>
+            </w:r>
+          </w:p>
+        </w:tc>
+        <w:tc>
+          <w:tcPr>
+            <w:tcW w:type="dxa" w:w="3099"/>
+            <w:vAlign w:val="center"/>
+            <w:shd w:fill="F5F6F5"/>
+            <w:tcMar>
+              <w:top w:w="100" w:type="dxa"/>
+              <w:left w:w="100" w:type="dxa"/>
+              <w:bottom w:w="100" w:type="dxa"/>
+              <w:right w:w="100" w:type="dxa"/>
+            </w:tcMar>
+          </w:tcPr>
+          <w:p>
+            <w:pPr>
+              <w:spacing w:after="0"/>
+              <w:ind w:firstLine="0"/>
+            </w:pPr>
+            <w:r>
+              <w:rPr>
+                <w:b w:val="0"/>
+                <w:color w:val="222222"/>
+                <w:sz w:val="17"/>
+              </w:rPr>
+              <w:t>识别有效部署点</w:t>
+            </w:r>
+          </w:p>
+        </w:tc>
+        <w:tc>
+          <w:tcPr>
+            <w:tcW w:type="dxa" w:w="3099"/>
+            <w:vAlign w:val="center"/>
+            <w:shd w:fill="F5F6F5"/>
+            <w:tcMar>
+              <w:top w:w="100" w:type="dxa"/>
+              <w:left w:w="100" w:type="dxa"/>
+              <w:bottom w:w="100" w:type="dxa"/>
+              <w:right w:w="100" w:type="dxa"/>
+            </w:tcMar>
+          </w:tcPr>
+          <w:p>
+            <w:pPr>
+              <w:spacing w:after="0"/>
+              <w:ind w:firstLine="0"/>
+            </w:pPr>
+            <w:r>
+              <w:rPr>
+                <w:b w:val="0"/>
+                <w:color w:val="222222"/>
+                <w:sz w:val="17"/>
+              </w:rPr>
+              <w:t>把失败转成下一次选择</w:t>
+            </w:r>
+          </w:p>
+        </w:tc>
+      </w:tr>
+    </w:tbl>
+    <w:p/>
+    <w:p>
+      <w:r>
+        <w:t>“能被反制”不是装置失效。可识别的威胁仍然能改变对手路线，也更适合让玩家学习。</w:t>
+      </w:r>
+    </w:p>
+    <w:p>
+      <w:pPr>
+        <w:spacing w:line="264" w:lineRule="auto"/>
+        <w:ind w:firstLine="0"/>
+        <w:jc w:val="center"/>
+      </w:pPr>
+      <w:r>
+        <w:t>来源：D3</w:t>
+      </w:r>
+    </w:p>
+    <w:p>
+      <w:pPr>
+        <w:pStyle w:val="Heading1"/>
+      </w:pPr>
+      <w:r>
+        <w:t>12 局面推演：满包小队要不要穿过开阔地？</w:t>
       </w:r>
     </w:p>
     <w:p>
       <w:r>
-        <w:t>配装券和任务奖励能缓解重新出发的压力，却不能自动解决这个矛盾。[1] 如果玩家连失败原因都看不懂，再送一套装备，也只是让他再经历一次无法解释的损失。我会更看重两件具体的事：重新准备一局是否足够方便，以及交战反馈能否帮助他区分操作失误与装备差距。</w:t>
-      </w:r>
-    </w:p>
-    <w:p>
-      <w:r>
-        <w:t>成长目标也不宜只剩仓库总价值。对于练枪的人，能更从容地处理一次遭遇就是进步；对于任务玩家，带出缺失材料可能比多赚一笔钱更有意义。任务和搜集系统提供多种目标，前提是不同目标真的能安排出不同的路线和投入，而不只是把同一场战斗换几个奖励名称。</w:t>
+        <w:t>设定：三人已完成本轮搜集；一人受伤，右前方疑似有人，前方有直达路和侧路。图为自绘假设地形，不对应真实地图点位。</w:t>
       </w:r>
     </w:p>
     <w:p>
@@ -351,27 +2473,12 @@
         <w:pStyle w:val="Heading2"/>
       </w:pPr>
       <w:r>
-        <w:t>干员的取舍应当给对手留下办法</w:t>
+        <w:t>直达路的条件</w:t>
       </w:r>
     </w:p>
     <w:p>
       <w:r>
-        <w:t>有技能之后，小队可以用较明确的方式补信息、掩护移动和争取进攻机会，协作内容比单纯交换装备更多。不过，技能让己方减少风险时，也可能在减少对手能做的事。</w:t>
-      </w:r>
-    </w:p>
-    <w:p>
-      <w:r>
-        <w:t>例如，用装置封住一条窄路，如果对方能通过声音辨认、发现后处理，或者付出绕行代价换一条路，装置就会产生取舍。如果只能在毫无预警的情况下吃到控制，这种体验更接近被规则处罚。官方曾在牧羊人的历史调整中增大声波陷阱的可听范围，并明确提到希望对手有更多反制空间。[5]</w:t>
-      </w:r>
-    </w:p>
-    <w:p>
-      <w:r>
-        <w:t>这条历史改动值得引用，因为它具体说明了平衡可以改哪里：不一定先减伤害，也可以让对方更早察觉。对搜打撤而言，这一点尤其重要。无法理解的一次失败，影响的不只是一场对枪，还包括带入的装备和刚搜到的物资。</w:t>
-      </w:r>
-    </w:p>
-    <w:p>
-      <w:r>
-        <w:t>我对烽火地带的判断是：它最有意思的部分，在于搜集所得、队伍状态和个人目标会一起改变下一步行动。干员系统应当为这些行动提供不同办法。分析一个技能好不好，最终还是要回到具体局面：它让小队多做了什么，对手还能怎样应对，使用后又留下什么问题。</w:t>
+        <w:t>距离短，但必须穿过高点可能覆盖的空地。先确认疑似枪线；若信息支持通过，再用遮蔽衔接两段掩体。第三人负责看后方，不应三个人都盯同一个标记。</w:t>
       </w:r>
     </w:p>
     <w:p>
@@ -379,73 +2486,1931 @@
         <w:pStyle w:val="Heading2"/>
       </w:pPr>
       <w:r>
-        <w:t>参考资料</w:t>
+        <w:t>侧路不是免费安全</w:t>
+      </w:r>
+    </w:p>
+    <w:p>
+      <w:r>
+        <w:t>侧路遮挡较多，却经过狭窄出口，也需要更多时间。若原路已被追击，侧路出口不明，绕行可能把正面的显性威胁换成出口的未知威胁。治疗应安排在遮挡内，而不是让队伍停在转角中央。</w:t>
       </w:r>
     </w:p>
     <w:p>
       <w:pPr>
-        <w:spacing w:line="276" w:lineRule="auto"/>
-        <w:ind w:firstLine="0"/>
+        <w:pStyle w:val="Heading2"/>
       </w:pPr>
       <w:r>
-        <w:rPr>
-          <w:sz w:val="18"/>
-        </w:rPr>
-        <w:t>[1] Garena Delta Force，Operations Mode 101，2026-02-20。基础规则参考，未采用移动端声音指示器描述。https://deltaforce.garena.com/en/news/system/RMDWVM</w:t>
+        <w:t>决定改变的信号</w:t>
+      </w:r>
+    </w:p>
+    <w:p>
+      <w:r>
+        <w:t>若前方确认多人架枪且侧路有队友视野，倾向绕行；若时间不足，直达路又有明确遮蔽窗口，可组织分段通过。这里没有必胜技能顺序，关键是每次拿到新线索后更新选择。</w:t>
+      </w:r>
+    </w:p>
+    <w:p>
+      <w:r>
+        <w:t>图表：路线 A 短而暴露；路线 B 长但出口未知</w:t>
+      </w:r>
+    </w:p>
+    <w:p>
+      <w:r>
+        <w:t>技能服务的是通过危险区这个任务。把“先探、再烟、再冲”写成固定连招，会漏掉应该撤回或换路的情况。</w:t>
       </w:r>
     </w:p>
     <w:p>
       <w:pPr>
-        <w:spacing w:line="276" w:lineRule="auto"/>
+        <w:spacing w:line="264" w:lineRule="auto"/>
         <w:ind w:firstLine="0"/>
+        <w:jc w:val="center"/>
       </w:pPr>
       <w:r>
-        <w:rPr>
-          <w:sz w:val="18"/>
-        </w:rPr>
-        <w:t>[2] Delta Force 官方地图工具。文中假设局面不对应某张地图的精确路径。https://www.playdeltaforce.com/act/mapswiki/?lang=en</w:t>
+        <w:t>来源：本文模型 / 假设推演</w:t>
       </w:r>
     </w:p>
     <w:p>
       <w:pPr>
-        <w:spacing w:line="276" w:lineRule="auto"/>
         <w:ind w:firstLine="0"/>
+        <w:jc w:val="center"/>
       </w:pPr>
       <w:r>
-        <w:rPr>
-          <w:sz w:val="18"/>
-        </w:rPr>
-        <w:t>[3] Garena Delta Force 官方干员介绍。用于代表干员的能力方向，不作为当前版本强度结论。https://deltaforce.garena.com/en/?redirect=0</w:t>
+        <w:drawing>
+          <wp:inline xmlns:a="http://schemas.openxmlformats.org/drawingml/2006/main" xmlns:pic="http://schemas.openxmlformats.org/drawingml/2006/picture">
+            <wp:extent cx="5760000" cy="3240000"/>
+            <wp:docPr id="4" name="Picture 4" descr="满包撤离的两条假设路线"/>
+            <wp:cNvGraphicFramePr>
+              <a:graphicFrameLocks noChangeAspect="1"/>
+            </wp:cNvGraphicFramePr>
+            <a:graphic>
+              <a:graphicData uri="http://schemas.openxmlformats.org/drawingml/2006/picture">
+                <pic:pic>
+                  <pic:nvPicPr>
+                    <pic:cNvPr id="0" name="delta-route.png"/>
+                    <pic:cNvPicPr/>
+                  </pic:nvPicPr>
+                  <pic:blipFill>
+                    <a:blip r:embed="rId13"/>
+                    <a:stretch>
+                      <a:fillRect/>
+                    </a:stretch>
+                  </pic:blipFill>
+                  <pic:spPr>
+                    <a:xfrm>
+                      <a:off x="0" y="0"/>
+                      <a:ext cx="5760000" cy="3240000"/>
+                    </a:xfrm>
+                    <a:prstGeom prst="rect"/>
+                  </pic:spPr>
+                </pic:pic>
+              </a:graphicData>
+            </a:graphic>
+          </wp:inline>
+        </w:drawing>
       </w:r>
     </w:p>
     <w:p>
       <w:pPr>
-        <w:spacing w:line="276" w:lineRule="auto"/>
+        <w:spacing w:line="264" w:lineRule="auto"/>
         <w:ind w:firstLine="0"/>
+        <w:jc w:val="center"/>
       </w:pPr>
       <w:r>
-        <w:rPr>
-          <w:sz w:val="18"/>
-        </w:rPr>
-        <w:t>[4] Delta Force 官方工具站。包含配装、地图及特勤处制造等入口。https://www.playdeltaforce.com/events/hq/en/</w:t>
+        <w:t>图 满包撤离的两条假设路线。图中关系为本文归纳，不是客户端内部架构。</w:t>
       </w:r>
     </w:p>
     <w:p>
       <w:pPr>
-        <w:spacing w:line="276" w:lineRule="auto"/>
-        <w:ind w:firstLine="0"/>
+        <w:pStyle w:val="Heading1"/>
       </w:pPr>
       <w:r>
-        <w:rPr>
-          <w:sz w:val="18"/>
-        </w:rPr>
-        <w:t>[5] Garena Delta Force，2025-07-08 更新公告。牧羊人声音提示的历史设计案例，不代表现行数值。https://deltaforce.garena.com/en/news/announcement/V6J38U</w:t>
+        <w:t>13 拿掉一个工具，才能看清它原来解决什么</w:t>
+      </w:r>
+    </w:p>
+    <w:p>
+      <w:r>
+        <w:t>保持上一节的假设地形和目标不变，只改变工具配置。这样可以检查阵容分析是否只是给技能贴好听的标签。</w:t>
+      </w:r>
+    </w:p>
+    <w:p>
+      <w:pPr>
+        <w:pStyle w:val="Heading2"/>
+      </w:pPr>
+      <w:r>
+        <w:t>比较方法</w:t>
+      </w:r>
+    </w:p>
+    <w:p>
+      <w:r>
+        <w:t>表中不是实际禁用技能实验，也没有声称胜率变化。它是逐项移除工具的推演：其他条件尽量不变，再列出小队必须付出的替代成本。能被普通行为补上，不等于该技能没有价值。</w:t>
+      </w:r>
+    </w:p>
+    <w:p>
+      <w:pPr>
+        <w:pStyle w:val="Heading2"/>
+      </w:pPr>
+      <w:r>
+        <w:t>替代与不可替代</w:t>
+      </w:r>
+    </w:p>
+    <w:p>
+      <w:r>
+        <w:t>没有侦察，可以靠探头和站位获得线索，但暴露成本更高；没有支援，可以带药，代价是携带与使用成本。不能因此得出某个干员必须上场，因为路线、装备和玩家配合也能补足缺口。</w:t>
+      </w:r>
+    </w:p>
+    <w:p>
+      <w:pPr>
+        <w:pStyle w:val="Heading2"/>
+      </w:pPr>
+      <w:r>
+        <w:t>一条可被推翻的判断</w:t>
+      </w:r>
+    </w:p>
+    <w:p>
+      <w:r>
+        <w:t>若在相近地图、物资和水平条件下，满包队并没有更多利用信息与遮蔽避战，本文“携带收益改变技能用途”的判断就需要收窄。它可能只适用于协作较好、并以撤离为首要目标的小队。</w:t>
+      </w:r>
+    </w:p>
+    <w:p>
+      <w:r>
+        <w:t>图表：移除工具后的成本转移</w:t>
+      </w:r>
+    </w:p>
+    <w:tbl>
+      <w:tblPr>
+        <w:tblW w:type="auto" w:w="0"/>
+        <w:tblLayout w:type="fixed"/>
+        <w:tblLook w:firstColumn="1" w:firstRow="1" w:lastColumn="0" w:lastRow="0" w:noHBand="0" w:noVBand="1" w:val="04A0"/>
+      </w:tblPr>
+      <w:tblGrid>
+        <w:gridCol w:w="3099"/>
+        <w:gridCol w:w="3099"/>
+        <w:gridCol w:w="3099"/>
+      </w:tblGrid>
+      <w:tr>
+        <w:trPr>
+          <w:tblHeader/>
+        </w:trPr>
+        <w:tc>
+          <w:tcPr>
+            <w:tcW w:type="dxa" w:w="3099"/>
+            <w:vAlign w:val="center"/>
+            <w:shd w:fill="3f6f62"/>
+            <w:tcMar>
+              <w:top w:w="100" w:type="dxa"/>
+              <w:left w:w="100" w:type="dxa"/>
+              <w:bottom w:w="100" w:type="dxa"/>
+              <w:right w:w="100" w:type="dxa"/>
+            </w:tcMar>
+          </w:tcPr>
+          <w:p>
+            <w:pPr>
+              <w:spacing w:after="0"/>
+              <w:ind w:firstLine="0"/>
+            </w:pPr>
+            <w:r>
+              <w:rPr>
+                <w:b/>
+                <w:color w:val="FFFFFF"/>
+                <w:sz w:val="17"/>
+              </w:rPr>
+              <w:t>移除什么</w:t>
+            </w:r>
+          </w:p>
+        </w:tc>
+        <w:tc>
+          <w:tcPr>
+            <w:tcW w:type="dxa" w:w="3099"/>
+            <w:vAlign w:val="center"/>
+            <w:shd w:fill="3f6f62"/>
+            <w:tcMar>
+              <w:top w:w="100" w:type="dxa"/>
+              <w:left w:w="100" w:type="dxa"/>
+              <w:bottom w:w="100" w:type="dxa"/>
+              <w:right w:w="100" w:type="dxa"/>
+            </w:tcMar>
+          </w:tcPr>
+          <w:p>
+            <w:pPr>
+              <w:spacing w:after="0"/>
+              <w:ind w:firstLine="0"/>
+            </w:pPr>
+            <w:r>
+              <w:rPr>
+                <w:b/>
+                <w:color w:val="FFFFFF"/>
+                <w:sz w:val="17"/>
+              </w:rPr>
+              <w:t>可能替代办法</w:t>
+            </w:r>
+          </w:p>
+        </w:tc>
+        <w:tc>
+          <w:tcPr>
+            <w:tcW w:type="dxa" w:w="3099"/>
+            <w:vAlign w:val="center"/>
+            <w:shd w:fill="3f6f62"/>
+            <w:tcMar>
+              <w:top w:w="100" w:type="dxa"/>
+              <w:left w:w="100" w:type="dxa"/>
+              <w:bottom w:w="100" w:type="dxa"/>
+              <w:right w:w="100" w:type="dxa"/>
+            </w:tcMar>
+          </w:tcPr>
+          <w:p>
+            <w:pPr>
+              <w:spacing w:after="0"/>
+              <w:ind w:firstLine="0"/>
+            </w:pPr>
+            <w:r>
+              <w:rPr>
+                <w:b/>
+                <w:color w:val="FFFFFF"/>
+                <w:sz w:val="17"/>
+              </w:rPr>
+              <w:t>新增成本</w:t>
+            </w:r>
+          </w:p>
+        </w:tc>
+      </w:tr>
+      <w:tr>
+        <w:tc>
+          <w:tcPr>
+            <w:tcW w:type="dxa" w:w="3099"/>
+            <w:vAlign w:val="center"/>
+            <w:shd w:fill="F5F6F5"/>
+            <w:tcMar>
+              <w:top w:w="100" w:type="dxa"/>
+              <w:left w:w="100" w:type="dxa"/>
+              <w:bottom w:w="100" w:type="dxa"/>
+              <w:right w:w="100" w:type="dxa"/>
+            </w:tcMar>
+          </w:tcPr>
+          <w:p>
+            <w:pPr>
+              <w:spacing w:after="0"/>
+              <w:ind w:firstLine="0"/>
+            </w:pPr>
+            <w:r>
+              <w:rPr>
+                <w:b w:val="0"/>
+                <w:color w:val="222222"/>
+                <w:sz w:val="17"/>
+              </w:rPr>
+              <w:t>侦察工具</w:t>
+            </w:r>
+          </w:p>
+        </w:tc>
+        <w:tc>
+          <w:tcPr>
+            <w:tcW w:type="dxa" w:w="3099"/>
+            <w:vAlign w:val="center"/>
+            <w:shd w:fill="F5F6F5"/>
+            <w:tcMar>
+              <w:top w:w="100" w:type="dxa"/>
+              <w:left w:w="100" w:type="dxa"/>
+              <w:bottom w:w="100" w:type="dxa"/>
+              <w:right w:w="100" w:type="dxa"/>
+            </w:tcMar>
+          </w:tcPr>
+          <w:p>
+            <w:pPr>
+              <w:spacing w:after="0"/>
+              <w:ind w:firstLine="0"/>
+            </w:pPr>
+            <w:r>
+              <w:rPr>
+                <w:b w:val="0"/>
+                <w:color w:val="222222"/>
+                <w:sz w:val="17"/>
+              </w:rPr>
+              <w:t>逐段看角 / 队友架视野</w:t>
+            </w:r>
+          </w:p>
+        </w:tc>
+        <w:tc>
+          <w:tcPr>
+            <w:tcW w:type="dxa" w:w="3099"/>
+            <w:vAlign w:val="center"/>
+            <w:shd w:fill="F5F6F5"/>
+            <w:tcMar>
+              <w:top w:w="100" w:type="dxa"/>
+              <w:left w:w="100" w:type="dxa"/>
+              <w:bottom w:w="100" w:type="dxa"/>
+              <w:right w:w="100" w:type="dxa"/>
+            </w:tcMar>
+          </w:tcPr>
+          <w:p>
+            <w:pPr>
+              <w:spacing w:after="0"/>
+              <w:ind w:firstLine="0"/>
+            </w:pPr>
+            <w:r>
+              <w:rPr>
+                <w:b w:val="0"/>
+                <w:color w:val="222222"/>
+                <w:sz w:val="17"/>
+              </w:rPr>
+              <w:t>时间与身体暴露</w:t>
+            </w:r>
+          </w:p>
+        </w:tc>
+      </w:tr>
+      <w:tr>
+        <w:tc>
+          <w:tcPr>
+            <w:tcW w:type="dxa" w:w="3099"/>
+            <w:vAlign w:val="center"/>
+            <w:shd w:fill="F5F6F5"/>
+            <w:tcMar>
+              <w:top w:w="100" w:type="dxa"/>
+              <w:left w:w="100" w:type="dxa"/>
+              <w:bottom w:w="100" w:type="dxa"/>
+              <w:right w:w="100" w:type="dxa"/>
+            </w:tcMar>
+          </w:tcPr>
+          <w:p>
+            <w:pPr>
+              <w:spacing w:after="0"/>
+              <w:ind w:firstLine="0"/>
+            </w:pPr>
+            <w:r>
+              <w:rPr>
+                <w:b w:val="0"/>
+                <w:color w:val="222222"/>
+                <w:sz w:val="17"/>
+              </w:rPr>
+              <w:t>恢复工具</w:t>
+            </w:r>
+          </w:p>
+        </w:tc>
+        <w:tc>
+          <w:tcPr>
+            <w:tcW w:type="dxa" w:w="3099"/>
+            <w:vAlign w:val="center"/>
+            <w:shd w:fill="F5F6F5"/>
+            <w:tcMar>
+              <w:top w:w="100" w:type="dxa"/>
+              <w:left w:w="100" w:type="dxa"/>
+              <w:bottom w:w="100" w:type="dxa"/>
+              <w:right w:w="100" w:type="dxa"/>
+            </w:tcMar>
+          </w:tcPr>
+          <w:p>
+            <w:pPr>
+              <w:spacing w:after="0"/>
+              <w:ind w:firstLine="0"/>
+            </w:pPr>
+            <w:r>
+              <w:rPr>
+                <w:b w:val="0"/>
+                <w:color w:val="222222"/>
+                <w:sz w:val="17"/>
+              </w:rPr>
+              <w:t>消耗药品 / 提前撤离</w:t>
+            </w:r>
+          </w:p>
+        </w:tc>
+        <w:tc>
+          <w:tcPr>
+            <w:tcW w:type="dxa" w:w="3099"/>
+            <w:vAlign w:val="center"/>
+            <w:shd w:fill="F5F6F5"/>
+            <w:tcMar>
+              <w:top w:w="100" w:type="dxa"/>
+              <w:left w:w="100" w:type="dxa"/>
+              <w:bottom w:w="100" w:type="dxa"/>
+              <w:right w:w="100" w:type="dxa"/>
+            </w:tcMar>
+          </w:tcPr>
+          <w:p>
+            <w:pPr>
+              <w:spacing w:after="0"/>
+              <w:ind w:firstLine="0"/>
+            </w:pPr>
+            <w:r>
+              <w:rPr>
+                <w:b w:val="0"/>
+                <w:color w:val="222222"/>
+                <w:sz w:val="17"/>
+              </w:rPr>
+              <w:t>物资、操作时间或少搜一段</w:t>
+            </w:r>
+          </w:p>
+        </w:tc>
+      </w:tr>
+      <w:tr>
+        <w:tc>
+          <w:tcPr>
+            <w:tcW w:type="dxa" w:w="3099"/>
+            <w:vAlign w:val="center"/>
+            <w:shd w:fill="F5F6F5"/>
+            <w:tcMar>
+              <w:top w:w="100" w:type="dxa"/>
+              <w:left w:w="100" w:type="dxa"/>
+              <w:bottom w:w="100" w:type="dxa"/>
+              <w:right w:w="100" w:type="dxa"/>
+            </w:tcMar>
+          </w:tcPr>
+          <w:p>
+            <w:pPr>
+              <w:spacing w:after="0"/>
+              <w:ind w:firstLine="0"/>
+            </w:pPr>
+            <w:r>
+              <w:rPr>
+                <w:b w:val="0"/>
+                <w:color w:val="222222"/>
+                <w:sz w:val="17"/>
+              </w:rPr>
+              <w:t>突破工具</w:t>
+            </w:r>
+          </w:p>
+        </w:tc>
+        <w:tc>
+          <w:tcPr>
+            <w:tcW w:type="dxa" w:w="3099"/>
+            <w:vAlign w:val="center"/>
+            <w:shd w:fill="F5F6F5"/>
+            <w:tcMar>
+              <w:top w:w="100" w:type="dxa"/>
+              <w:left w:w="100" w:type="dxa"/>
+              <w:bottom w:w="100" w:type="dxa"/>
+              <w:right w:w="100" w:type="dxa"/>
+            </w:tcMar>
+          </w:tcPr>
+          <w:p>
+            <w:pPr>
+              <w:spacing w:after="0"/>
+              <w:ind w:firstLine="0"/>
+            </w:pPr>
+            <w:r>
+              <w:rPr>
+                <w:b w:val="0"/>
+                <w:color w:val="222222"/>
+                <w:sz w:val="17"/>
+              </w:rPr>
+              <w:t>等机会 / 换入口</w:t>
+            </w:r>
+          </w:p>
+        </w:tc>
+        <w:tc>
+          <w:tcPr>
+            <w:tcW w:type="dxa" w:w="3099"/>
+            <w:vAlign w:val="center"/>
+            <w:shd w:fill="F5F6F5"/>
+            <w:tcMar>
+              <w:top w:w="100" w:type="dxa"/>
+              <w:left w:w="100" w:type="dxa"/>
+              <w:bottom w:w="100" w:type="dxa"/>
+              <w:right w:w="100" w:type="dxa"/>
+            </w:tcMar>
+          </w:tcPr>
+          <w:p>
+            <w:pPr>
+              <w:spacing w:after="0"/>
+              <w:ind w:firstLine="0"/>
+            </w:pPr>
+            <w:r>
+              <w:rPr>
+                <w:b w:val="0"/>
+                <w:color w:val="222222"/>
+                <w:sz w:val="17"/>
+              </w:rPr>
+              <w:t>放弃短时压迫机会</w:t>
+            </w:r>
+          </w:p>
+        </w:tc>
+      </w:tr>
+      <w:tr>
+        <w:tc>
+          <w:tcPr>
+            <w:tcW w:type="dxa" w:w="3099"/>
+            <w:vAlign w:val="center"/>
+            <w:shd w:fill="F5F6F5"/>
+            <w:tcMar>
+              <w:top w:w="100" w:type="dxa"/>
+              <w:left w:w="100" w:type="dxa"/>
+              <w:bottom w:w="100" w:type="dxa"/>
+              <w:right w:w="100" w:type="dxa"/>
+            </w:tcMar>
+          </w:tcPr>
+          <w:p>
+            <w:pPr>
+              <w:spacing w:after="0"/>
+              <w:ind w:firstLine="0"/>
+            </w:pPr>
+            <w:r>
+              <w:rPr>
+                <w:b w:val="0"/>
+                <w:color w:val="222222"/>
+                <w:sz w:val="17"/>
+              </w:rPr>
+              <w:t>布防工具</w:t>
+            </w:r>
+          </w:p>
+        </w:tc>
+        <w:tc>
+          <w:tcPr>
+            <w:tcW w:type="dxa" w:w="3099"/>
+            <w:vAlign w:val="center"/>
+            <w:shd w:fill="F5F6F5"/>
+            <w:tcMar>
+              <w:top w:w="100" w:type="dxa"/>
+              <w:left w:w="100" w:type="dxa"/>
+              <w:bottom w:w="100" w:type="dxa"/>
+              <w:right w:w="100" w:type="dxa"/>
+            </w:tcMar>
+          </w:tcPr>
+          <w:p>
+            <w:pPr>
+              <w:spacing w:after="0"/>
+              <w:ind w:firstLine="0"/>
+            </w:pPr>
+            <w:r>
+              <w:rPr>
+                <w:b w:val="0"/>
+                <w:color w:val="222222"/>
+                <w:sz w:val="17"/>
+              </w:rPr>
+              <w:t>留人看后路</w:t>
+            </w:r>
+          </w:p>
+        </w:tc>
+        <w:tc>
+          <w:tcPr>
+            <w:tcW w:type="dxa" w:w="3099"/>
+            <w:vAlign w:val="center"/>
+            <w:shd w:fill="F5F6F5"/>
+            <w:tcMar>
+              <w:top w:w="100" w:type="dxa"/>
+              <w:left w:w="100" w:type="dxa"/>
+              <w:bottom w:w="100" w:type="dxa"/>
+              <w:right w:w="100" w:type="dxa"/>
+            </w:tcMar>
+          </w:tcPr>
+          <w:p>
+            <w:pPr>
+              <w:spacing w:after="0"/>
+              <w:ind w:firstLine="0"/>
+            </w:pPr>
+            <w:r>
+              <w:rPr>
+                <w:b w:val="0"/>
+                <w:color w:val="222222"/>
+                <w:sz w:val="17"/>
+              </w:rPr>
+              <w:t>正面可用人数减少</w:t>
+            </w:r>
+          </w:p>
+        </w:tc>
+      </w:tr>
+      <w:tr>
+        <w:tc>
+          <w:tcPr>
+            <w:tcW w:type="dxa" w:w="3099"/>
+            <w:vAlign w:val="center"/>
+            <w:shd w:fill="F5F6F5"/>
+            <w:tcMar>
+              <w:top w:w="100" w:type="dxa"/>
+              <w:left w:w="100" w:type="dxa"/>
+              <w:bottom w:w="100" w:type="dxa"/>
+              <w:right w:w="100" w:type="dxa"/>
+            </w:tcMar>
+          </w:tcPr>
+          <w:p>
+            <w:pPr>
+              <w:spacing w:after="0"/>
+              <w:ind w:firstLine="0"/>
+            </w:pPr>
+            <w:r>
+              <w:rPr>
+                <w:b w:val="0"/>
+                <w:color w:val="222222"/>
+                <w:sz w:val="17"/>
+              </w:rPr>
+              <w:t>队友沟通</w:t>
+            </w:r>
+          </w:p>
+        </w:tc>
+        <w:tc>
+          <w:tcPr>
+            <w:tcW w:type="dxa" w:w="3099"/>
+            <w:vAlign w:val="center"/>
+            <w:shd w:fill="F5F6F5"/>
+            <w:tcMar>
+              <w:top w:w="100" w:type="dxa"/>
+              <w:left w:w="100" w:type="dxa"/>
+              <w:bottom w:w="100" w:type="dxa"/>
+              <w:right w:w="100" w:type="dxa"/>
+            </w:tcMar>
+          </w:tcPr>
+          <w:p>
+            <w:pPr>
+              <w:spacing w:after="0"/>
+              <w:ind w:firstLine="0"/>
+            </w:pPr>
+            <w:r>
+              <w:rPr>
+                <w:b w:val="0"/>
+                <w:color w:val="222222"/>
+                <w:sz w:val="17"/>
+              </w:rPr>
+              <w:t>依赖标记与默认习惯</w:t>
+            </w:r>
+          </w:p>
+        </w:tc>
+        <w:tc>
+          <w:tcPr>
+            <w:tcW w:type="dxa" w:w="3099"/>
+            <w:vAlign w:val="center"/>
+            <w:shd w:fill="F5F6F5"/>
+            <w:tcMar>
+              <w:top w:w="100" w:type="dxa"/>
+              <w:left w:w="100" w:type="dxa"/>
+              <w:bottom w:w="100" w:type="dxa"/>
+              <w:right w:w="100" w:type="dxa"/>
+            </w:tcMar>
+          </w:tcPr>
+          <w:p>
+            <w:pPr>
+              <w:spacing w:after="0"/>
+              <w:ind w:firstLine="0"/>
+            </w:pPr>
+            <w:r>
+              <w:rPr>
+                <w:b w:val="0"/>
+                <w:color w:val="222222"/>
+                <w:sz w:val="17"/>
+              </w:rPr>
+              <w:t>反馈慢，工具难以衔接</w:t>
+            </w:r>
+          </w:p>
+        </w:tc>
+      </w:tr>
+    </w:tbl>
+    <w:p/>
+    <w:p>
+      <w:r>
+        <w:t>只证明技能“有用”还不够。要指出不用它会增加什么成本，以及这些成本能否通过别的办法承担。</w:t>
+      </w:r>
+    </w:p>
+    <w:p>
+      <w:pPr>
+        <w:spacing w:line="264" w:lineRule="auto"/>
+        <w:ind w:firstLine="0"/>
+        <w:jc w:val="center"/>
+      </w:pPr>
+      <w:r>
+        <w:t>来源：本文模型 / 假设推演</w:t>
+      </w:r>
+    </w:p>
+    <w:p>
+      <w:pPr>
+        <w:pStyle w:val="Heading1"/>
+      </w:pPr>
+      <w:r>
+        <w:t>14 双模式平衡，先分目标，再分参数</w:t>
+      </w:r>
+    </w:p>
+    <w:p>
+      <w:r>
+        <w:t>同一技能进入不同模式，面对的损失结构、交战频率和目标都不同。共用表现不要求所有参数共用。</w:t>
+      </w:r>
+    </w:p>
+    <w:p>
+      <w:pPr>
+        <w:pStyle w:val="Heading2"/>
+      </w:pPr>
+      <w:r>
+        <w:t>同一名称不代表同一收益</w:t>
+      </w:r>
+    </w:p>
+    <w:p>
+      <w:r>
+        <w:t>全面战场围绕据点与持续战线组织战斗；烽火地带还要考虑携带收益的兑现。一次治疗、一次位移在两种循环中的使用频率和机会成本不同，因此不能用一边的体感直接判另一边强度。</w:t>
+      </w:r>
+    </w:p>
+    <w:p>
+      <w:pPr>
+        <w:pStyle w:val="Heading2"/>
+      </w:pPr>
+      <w:r>
+        <w:t>历史证据的用法</w:t>
+      </w:r>
+    </w:p>
+    <w:p>
+      <w:r>
+        <w:t>表中保留地区、模式和改动方向，用来证明开发者确实分别处理技能效果。它不证明这些旧数值在当前国服仍生效，也不证明改动后平衡已经成功。分析依据是约束差异，不是把旧公告当现行攻略。</w:t>
+      </w:r>
+    </w:p>
+    <w:p>
+      <w:pPr>
+        <w:pStyle w:val="Heading2"/>
+      </w:pPr>
+      <w:r>
+        <w:t>分开调也有代价</w:t>
+      </w:r>
+    </w:p>
+    <w:p>
+      <w:r>
+        <w:t>模式专属变化过多，会提高记忆负担。同一干员最好保留稳定的使用意图，再针对特定环境调整效果或参数；若操作逻辑也发生差异，界面与训练说明需要让玩家提前知道。</w:t>
+      </w:r>
+    </w:p>
+    <w:p>
+      <w:r>
+        <w:t>图表：Starfall 历史样本 / Garena / 2025-01</w:t>
+      </w:r>
+    </w:p>
+    <w:tbl>
+      <w:tblPr>
+        <w:tblW w:type="auto" w:w="0"/>
+        <w:tblLayout w:type="fixed"/>
+        <w:tblLook w:firstColumn="1" w:firstRow="1" w:lastColumn="0" w:lastRow="0" w:noHBand="0" w:noVBand="1" w:val="04A0"/>
+      </w:tblPr>
+      <w:tblGrid>
+        <w:gridCol w:w="3099"/>
+        <w:gridCol w:w="3099"/>
+        <w:gridCol w:w="3099"/>
+      </w:tblGrid>
+      <w:tr>
+        <w:trPr>
+          <w:tblHeader/>
+        </w:trPr>
+        <w:tc>
+          <w:tcPr>
+            <w:tcW w:type="dxa" w:w="3099"/>
+            <w:vAlign w:val="center"/>
+            <w:shd w:fill="3f6f62"/>
+            <w:tcMar>
+              <w:top w:w="100" w:type="dxa"/>
+              <w:left w:w="100" w:type="dxa"/>
+              <w:bottom w:w="100" w:type="dxa"/>
+              <w:right w:w="100" w:type="dxa"/>
+            </w:tcMar>
+          </w:tcPr>
+          <w:p>
+            <w:pPr>
+              <w:spacing w:after="0"/>
+              <w:ind w:firstLine="0"/>
+            </w:pPr>
+            <w:r>
+              <w:rPr>
+                <w:b/>
+                <w:color w:val="FFFFFF"/>
+                <w:sz w:val="17"/>
+              </w:rPr>
+              <w:t>对象</w:t>
+            </w:r>
+          </w:p>
+        </w:tc>
+        <w:tc>
+          <w:tcPr>
+            <w:tcW w:type="dxa" w:w="3099"/>
+            <w:vAlign w:val="center"/>
+            <w:shd w:fill="3f6f62"/>
+            <w:tcMar>
+              <w:top w:w="100" w:type="dxa"/>
+              <w:left w:w="100" w:type="dxa"/>
+              <w:bottom w:w="100" w:type="dxa"/>
+              <w:right w:w="100" w:type="dxa"/>
+            </w:tcMar>
+          </w:tcPr>
+          <w:p>
+            <w:pPr>
+              <w:spacing w:after="0"/>
+              <w:ind w:firstLine="0"/>
+            </w:pPr>
+            <w:r>
+              <w:rPr>
+                <w:b/>
+                <w:color w:val="FFFFFF"/>
+                <w:sz w:val="17"/>
+              </w:rPr>
+              <w:t>模式专属调整</w:t>
+            </w:r>
+          </w:p>
+        </w:tc>
+        <w:tc>
+          <w:tcPr>
+            <w:tcW w:type="dxa" w:w="3099"/>
+            <w:vAlign w:val="center"/>
+            <w:shd w:fill="3f6f62"/>
+            <w:tcMar>
+              <w:top w:w="100" w:type="dxa"/>
+              <w:left w:w="100" w:type="dxa"/>
+              <w:bottom w:w="100" w:type="dxa"/>
+              <w:right w:w="100" w:type="dxa"/>
+            </w:tcMar>
+          </w:tcPr>
+          <w:p>
+            <w:pPr>
+              <w:spacing w:after="0"/>
+              <w:ind w:firstLine="0"/>
+            </w:pPr>
+            <w:r>
+              <w:rPr>
+                <w:b/>
+                <w:color w:val="FFFFFF"/>
+                <w:sz w:val="17"/>
+              </w:rPr>
+              <w:t>能支持的结论</w:t>
+            </w:r>
+          </w:p>
+        </w:tc>
+      </w:tr>
+      <w:tr>
+        <w:tc>
+          <w:tcPr>
+            <w:tcW w:type="dxa" w:w="3099"/>
+            <w:vAlign w:val="center"/>
+            <w:shd w:fill="F5F6F5"/>
+            <w:tcMar>
+              <w:top w:w="100" w:type="dxa"/>
+              <w:left w:w="100" w:type="dxa"/>
+              <w:bottom w:w="100" w:type="dxa"/>
+              <w:right w:w="100" w:type="dxa"/>
+            </w:tcMar>
+          </w:tcPr>
+          <w:p>
+            <w:pPr>
+              <w:spacing w:after="0"/>
+              <w:ind w:firstLine="0"/>
+            </w:pPr>
+            <w:r>
+              <w:rPr>
+                <w:b w:val="0"/>
+                <w:color w:val="222222"/>
+                <w:sz w:val="17"/>
+              </w:rPr>
+              <w:t>蜂医</w:t>
+            </w:r>
+          </w:p>
+        </w:tc>
+        <w:tc>
+          <w:tcPr>
+            <w:tcW w:type="dxa" w:w="3099"/>
+            <w:vAlign w:val="center"/>
+            <w:shd w:fill="F5F6F5"/>
+            <w:tcMar>
+              <w:top w:w="100" w:type="dxa"/>
+              <w:left w:w="100" w:type="dxa"/>
+              <w:bottom w:w="100" w:type="dxa"/>
+              <w:right w:w="100" w:type="dxa"/>
+            </w:tcMar>
+          </w:tcPr>
+          <w:p>
+            <w:pPr>
+              <w:spacing w:after="0"/>
+              <w:ind w:firstLine="0"/>
+            </w:pPr>
+            <w:r>
+              <w:rPr>
+                <w:b w:val="0"/>
+                <w:color w:val="222222"/>
+                <w:sz w:val="17"/>
+              </w:rPr>
+              <w:t>Operations 治疗效果 20s → 60s</w:t>
+            </w:r>
+          </w:p>
+        </w:tc>
+        <w:tc>
+          <w:tcPr>
+            <w:tcW w:type="dxa" w:w="3099"/>
+            <w:vAlign w:val="center"/>
+            <w:shd w:fill="F5F6F5"/>
+            <w:tcMar>
+              <w:top w:w="100" w:type="dxa"/>
+              <w:left w:w="100" w:type="dxa"/>
+              <w:bottom w:w="100" w:type="dxa"/>
+              <w:right w:w="100" w:type="dxa"/>
+            </w:tcMar>
+          </w:tcPr>
+          <w:p>
+            <w:pPr>
+              <w:spacing w:after="0"/>
+              <w:ind w:firstLine="0"/>
+            </w:pPr>
+            <w:r>
+              <w:rPr>
+                <w:b w:val="0"/>
+                <w:color w:val="222222"/>
+                <w:sz w:val="17"/>
+              </w:rPr>
+              <w:t>恢复作用时间按模式处理</w:t>
+            </w:r>
+          </w:p>
+        </w:tc>
+      </w:tr>
+      <w:tr>
+        <w:tc>
+          <w:tcPr>
+            <w:tcW w:type="dxa" w:w="3099"/>
+            <w:vAlign w:val="center"/>
+            <w:shd w:fill="F5F6F5"/>
+            <w:tcMar>
+              <w:top w:w="100" w:type="dxa"/>
+              <w:left w:w="100" w:type="dxa"/>
+              <w:bottom w:w="100" w:type="dxa"/>
+              <w:right w:w="100" w:type="dxa"/>
+            </w:tcMar>
+          </w:tcPr>
+          <w:p>
+            <w:pPr>
+              <w:spacing w:after="0"/>
+              <w:ind w:firstLine="0"/>
+            </w:pPr>
+            <w:r>
+              <w:rPr>
+                <w:b w:val="0"/>
+                <w:color w:val="222222"/>
+                <w:sz w:val="17"/>
+              </w:rPr>
+              <w:t>露娜</w:t>
+            </w:r>
+          </w:p>
+        </w:tc>
+        <w:tc>
+          <w:tcPr>
+            <w:tcW w:type="dxa" w:w="3099"/>
+            <w:vAlign w:val="center"/>
+            <w:shd w:fill="F5F6F5"/>
+            <w:tcMar>
+              <w:top w:w="100" w:type="dxa"/>
+              <w:left w:w="100" w:type="dxa"/>
+              <w:bottom w:w="100" w:type="dxa"/>
+              <w:right w:w="100" w:type="dxa"/>
+            </w:tcMar>
+          </w:tcPr>
+          <w:p>
+            <w:pPr>
+              <w:spacing w:after="0"/>
+              <w:ind w:firstLine="0"/>
+            </w:pPr>
+            <w:r>
+              <w:rPr>
+                <w:b w:val="0"/>
+                <w:color w:val="222222"/>
+                <w:sz w:val="17"/>
+              </w:rPr>
+              <w:t>Warfare 探测箭可探测载具</w:t>
+            </w:r>
+          </w:p>
+        </w:tc>
+        <w:tc>
+          <w:tcPr>
+            <w:tcW w:type="dxa" w:w="3099"/>
+            <w:vAlign w:val="center"/>
+            <w:shd w:fill="F5F6F5"/>
+            <w:tcMar>
+              <w:top w:w="100" w:type="dxa"/>
+              <w:left w:w="100" w:type="dxa"/>
+              <w:bottom w:w="100" w:type="dxa"/>
+              <w:right w:w="100" w:type="dxa"/>
+            </w:tcMar>
+          </w:tcPr>
+          <w:p>
+            <w:pPr>
+              <w:spacing w:after="0"/>
+              <w:ind w:firstLine="0"/>
+            </w:pPr>
+            <w:r>
+              <w:rPr>
+                <w:b w:val="0"/>
+                <w:color w:val="222222"/>
+                <w:sz w:val="17"/>
+              </w:rPr>
+              <w:t>侦察对象受模式目标影响</w:t>
+            </w:r>
+          </w:p>
+        </w:tc>
+      </w:tr>
+      <w:tr>
+        <w:tc>
+          <w:tcPr>
+            <w:tcW w:type="dxa" w:w="3099"/>
+            <w:vAlign w:val="center"/>
+            <w:shd w:fill="F5F6F5"/>
+            <w:tcMar>
+              <w:top w:w="100" w:type="dxa"/>
+              <w:left w:w="100" w:type="dxa"/>
+              <w:bottom w:w="100" w:type="dxa"/>
+              <w:right w:w="100" w:type="dxa"/>
+            </w:tcMar>
+          </w:tcPr>
+          <w:p>
+            <w:pPr>
+              <w:spacing w:after="0"/>
+              <w:ind w:firstLine="0"/>
+            </w:pPr>
+            <w:r>
+              <w:rPr>
+                <w:b w:val="0"/>
+                <w:color w:val="222222"/>
+                <w:sz w:val="17"/>
+              </w:rPr>
+              <w:t>露娜</w:t>
+            </w:r>
+          </w:p>
+        </w:tc>
+        <w:tc>
+          <w:tcPr>
+            <w:tcW w:type="dxa" w:w="3099"/>
+            <w:vAlign w:val="center"/>
+            <w:shd w:fill="F5F6F5"/>
+            <w:tcMar>
+              <w:top w:w="100" w:type="dxa"/>
+              <w:left w:w="100" w:type="dxa"/>
+              <w:bottom w:w="100" w:type="dxa"/>
+              <w:right w:w="100" w:type="dxa"/>
+            </w:tcMar>
+          </w:tcPr>
+          <w:p>
+            <w:pPr>
+              <w:spacing w:after="0"/>
+              <w:ind w:firstLine="0"/>
+            </w:pPr>
+            <w:r>
+              <w:rPr>
+                <w:b w:val="0"/>
+                <w:color w:val="222222"/>
+                <w:sz w:val="17"/>
+              </w:rPr>
+              <w:t>Operations 冷却 45s → 40s</w:t>
+            </w:r>
+          </w:p>
+        </w:tc>
+        <w:tc>
+          <w:tcPr>
+            <w:tcW w:type="dxa" w:w="3099"/>
+            <w:vAlign w:val="center"/>
+            <w:shd w:fill="F5F6F5"/>
+            <w:tcMar>
+              <w:top w:w="100" w:type="dxa"/>
+              <w:left w:w="100" w:type="dxa"/>
+              <w:bottom w:w="100" w:type="dxa"/>
+              <w:right w:w="100" w:type="dxa"/>
+            </w:tcMar>
+          </w:tcPr>
+          <w:p>
+            <w:pPr>
+              <w:spacing w:after="0"/>
+              <w:ind w:firstLine="0"/>
+            </w:pPr>
+            <w:r>
+              <w:rPr>
+                <w:b w:val="0"/>
+                <w:color w:val="222222"/>
+                <w:sz w:val="17"/>
+              </w:rPr>
+              <w:t>信息供给节奏可分开调</w:t>
+            </w:r>
+          </w:p>
+        </w:tc>
+      </w:tr>
+      <w:tr>
+        <w:tc>
+          <w:tcPr>
+            <w:tcW w:type="dxa" w:w="3099"/>
+            <w:vAlign w:val="center"/>
+            <w:shd w:fill="F5F6F5"/>
+            <w:tcMar>
+              <w:top w:w="100" w:type="dxa"/>
+              <w:left w:w="100" w:type="dxa"/>
+              <w:bottom w:w="100" w:type="dxa"/>
+              <w:right w:w="100" w:type="dxa"/>
+            </w:tcMar>
+          </w:tcPr>
+          <w:p>
+            <w:pPr>
+              <w:spacing w:after="0"/>
+              <w:ind w:firstLine="0"/>
+            </w:pPr>
+            <w:r>
+              <w:rPr>
+                <w:b w:val="0"/>
+                <w:color w:val="222222"/>
+                <w:sz w:val="17"/>
+              </w:rPr>
+              <w:t>威龙</w:t>
+            </w:r>
+          </w:p>
+        </w:tc>
+        <w:tc>
+          <w:tcPr>
+            <w:tcW w:type="dxa" w:w="3099"/>
+            <w:vAlign w:val="center"/>
+            <w:shd w:fill="F5F6F5"/>
+            <w:tcMar>
+              <w:top w:w="100" w:type="dxa"/>
+              <w:left w:w="100" w:type="dxa"/>
+              <w:bottom w:w="100" w:type="dxa"/>
+              <w:right w:w="100" w:type="dxa"/>
+            </w:tcMar>
+          </w:tcPr>
+          <w:p>
+            <w:pPr>
+              <w:spacing w:after="0"/>
+              <w:ind w:firstLine="0"/>
+            </w:pPr>
+            <w:r>
+              <w:rPr>
+                <w:b w:val="0"/>
+                <w:color w:val="222222"/>
+                <w:sz w:val="17"/>
+              </w:rPr>
+              <w:t>Operations 磁吸炸弹伤害 125 → 110</w:t>
+            </w:r>
+          </w:p>
+        </w:tc>
+        <w:tc>
+          <w:tcPr>
+            <w:tcW w:type="dxa" w:w="3099"/>
+            <w:vAlign w:val="center"/>
+            <w:shd w:fill="F5F6F5"/>
+            <w:tcMar>
+              <w:top w:w="100" w:type="dxa"/>
+              <w:left w:w="100" w:type="dxa"/>
+              <w:bottom w:w="100" w:type="dxa"/>
+              <w:right w:w="100" w:type="dxa"/>
+            </w:tcMar>
+          </w:tcPr>
+          <w:p>
+            <w:pPr>
+              <w:spacing w:after="0"/>
+              <w:ind w:firstLine="0"/>
+            </w:pPr>
+            <w:r>
+              <w:rPr>
+                <w:b w:val="0"/>
+                <w:color w:val="222222"/>
+                <w:sz w:val="17"/>
+              </w:rPr>
+              <w:t>伤害压力按环境判断</w:t>
+            </w:r>
+          </w:p>
+        </w:tc>
+      </w:tr>
+      <w:tr>
+        <w:tc>
+          <w:tcPr>
+            <w:tcW w:type="dxa" w:w="3099"/>
+            <w:vAlign w:val="center"/>
+            <w:shd w:fill="F5F6F5"/>
+            <w:tcMar>
+              <w:top w:w="100" w:type="dxa"/>
+              <w:left w:w="100" w:type="dxa"/>
+              <w:bottom w:w="100" w:type="dxa"/>
+              <w:right w:w="100" w:type="dxa"/>
+            </w:tcMar>
+          </w:tcPr>
+          <w:p>
+            <w:pPr>
+              <w:spacing w:after="0"/>
+              <w:ind w:firstLine="0"/>
+            </w:pPr>
+            <w:r>
+              <w:rPr>
+                <w:b w:val="0"/>
+                <w:color w:val="222222"/>
+                <w:sz w:val="17"/>
+              </w:rPr>
+              <w:t>分析边界</w:t>
+            </w:r>
+          </w:p>
+        </w:tc>
+        <w:tc>
+          <w:tcPr>
+            <w:tcW w:type="dxa" w:w="3099"/>
+            <w:vAlign w:val="center"/>
+            <w:shd w:fill="F5F6F5"/>
+            <w:tcMar>
+              <w:top w:w="100" w:type="dxa"/>
+              <w:left w:w="100" w:type="dxa"/>
+              <w:bottom w:w="100" w:type="dxa"/>
+              <w:right w:w="100" w:type="dxa"/>
+            </w:tcMar>
+          </w:tcPr>
+          <w:p>
+            <w:pPr>
+              <w:spacing w:after="0"/>
+              <w:ind w:firstLine="0"/>
+            </w:pPr>
+            <w:r>
+              <w:rPr>
+                <w:b w:val="0"/>
+                <w:color w:val="222222"/>
+                <w:sz w:val="17"/>
+              </w:rPr>
+              <w:t>不是当前国服参数表</w:t>
+            </w:r>
+          </w:p>
+        </w:tc>
+        <w:tc>
+          <w:tcPr>
+            <w:tcW w:type="dxa" w:w="3099"/>
+            <w:vAlign w:val="center"/>
+            <w:shd w:fill="F5F6F5"/>
+            <w:tcMar>
+              <w:top w:w="100" w:type="dxa"/>
+              <w:left w:w="100" w:type="dxa"/>
+              <w:bottom w:w="100" w:type="dxa"/>
+              <w:right w:w="100" w:type="dxa"/>
+            </w:tcMar>
+          </w:tcPr>
+          <w:p>
+            <w:pPr>
+              <w:spacing w:after="0"/>
+              <w:ind w:firstLine="0"/>
+            </w:pPr>
+            <w:r>
+              <w:rPr>
+                <w:b w:val="0"/>
+                <w:color w:val="222222"/>
+                <w:sz w:val="17"/>
+              </w:rPr>
+              <w:t>不推断现行强度与最佳配队</w:t>
+            </w:r>
+          </w:p>
+        </w:tc>
+      </w:tr>
+    </w:tbl>
+    <w:p/>
+    <w:p>
+      <w:r>
+        <w:t>一份双模式分析应写清“哪种环境让哪个效果变得更值钱”，而非只说两个模式需要不同数值。</w:t>
+      </w:r>
+    </w:p>
+    <w:p>
+      <w:pPr>
+        <w:spacing w:line="264" w:lineRule="auto"/>
+        <w:ind w:firstLine="0"/>
+        <w:jc w:val="center"/>
+      </w:pPr>
+      <w:r>
+        <w:t>来源：D1、D2</w:t>
+      </w:r>
+    </w:p>
+    <w:p>
+      <w:pPr>
+        <w:pStyle w:val="Heading1"/>
+      </w:pPr>
+      <w:r>
+        <w:t>15 先改善小队对技能的理解，不急着再加技能</w:t>
+      </w:r>
+    </w:p>
+    <w:p>
+      <w:r>
+        <w:t>本文优先提出一个小改动：把已有信息反馈说清楚。它是待验证方案，不是现有游戏功能描述。</w:t>
+      </w:r>
+    </w:p>
+    <w:p>
+      <w:pPr>
+        <w:pStyle w:val="Heading2"/>
+      </w:pPr>
+      <w:r>
+        <w:t>方案：临时线索，而非安全认证</w:t>
+      </w:r>
+    </w:p>
+    <w:p>
+      <w:r>
+        <w:t>队伍共享标记显示线索来源与出现时间；线索过期后保留位置记忆，但弱化显示。不显示“区域安全”，也不自动推断敌人已离开。目的只是减少队友把旧信息当成实时信息的情况。</w:t>
+      </w:r>
+    </w:p>
+    <w:p>
+      <w:pPr>
+        <w:pStyle w:val="Heading2"/>
+      </w:pPr>
+      <w:r>
+        <w:t>为什么先做这个</w:t>
+      </w:r>
+    </w:p>
+    <w:p>
+      <w:r>
+        <w:t>官方已讨论道具密集、信息过易暴露和反制不清的问题。新增探测强度可能加重负担；区分线索时效则不增加信息来源。不过它也可能让屏幕更挤，所以需要同时检查误读和干扰。</w:t>
+      </w:r>
+    </w:p>
+    <w:p>
+      <w:pPr>
+        <w:pStyle w:val="Heading2"/>
+      </w:pPr>
+      <w:r>
+        <w:t>验证安排</w:t>
+      </w:r>
+    </w:p>
+    <w:p>
+      <w:r>
+        <w:t>先做 12 组相同假设局面的交叉体验，轮换新旧显示顺序；按双人沟通与三人完整沟通分开记录。样本只用于发现可用性问题，不用来宣布平衡成功。方案若让玩家盯 UI 而漏看敌人，应撤回或进一步减量。</w:t>
+      </w:r>
+    </w:p>
+    <w:p>
+      <w:r>
+        <w:t>图表：拟记录事件与失败条件 / 尚未采集</w:t>
+      </w:r>
+    </w:p>
+    <w:tbl>
+      <w:tblPr>
+        <w:tblW w:type="auto" w:w="0"/>
+        <w:tblLayout w:type="fixed"/>
+        <w:tblLook w:firstColumn="1" w:firstRow="1" w:lastColumn="0" w:lastRow="0" w:noHBand="0" w:noVBand="1" w:val="04A0"/>
+      </w:tblPr>
+      <w:tblGrid>
+        <w:gridCol w:w="3099"/>
+        <w:gridCol w:w="3099"/>
+        <w:gridCol w:w="3099"/>
+      </w:tblGrid>
+      <w:tr>
+        <w:trPr>
+          <w:tblHeader/>
+        </w:trPr>
+        <w:tc>
+          <w:tcPr>
+            <w:tcW w:type="dxa" w:w="3099"/>
+            <w:vAlign w:val="center"/>
+            <w:shd w:fill="3f6f62"/>
+            <w:tcMar>
+              <w:top w:w="100" w:type="dxa"/>
+              <w:left w:w="100" w:type="dxa"/>
+              <w:bottom w:w="100" w:type="dxa"/>
+              <w:right w:w="100" w:type="dxa"/>
+            </w:tcMar>
+          </w:tcPr>
+          <w:p>
+            <w:pPr>
+              <w:spacing w:after="0"/>
+              <w:ind w:firstLine="0"/>
+            </w:pPr>
+            <w:r>
+              <w:rPr>
+                <w:b/>
+                <w:color w:val="FFFFFF"/>
+                <w:sz w:val="17"/>
+              </w:rPr>
+              <w:t>记录项</w:t>
+            </w:r>
+          </w:p>
+        </w:tc>
+        <w:tc>
+          <w:tcPr>
+            <w:tcW w:type="dxa" w:w="3099"/>
+            <w:vAlign w:val="center"/>
+            <w:shd w:fill="3f6f62"/>
+            <w:tcMar>
+              <w:top w:w="100" w:type="dxa"/>
+              <w:left w:w="100" w:type="dxa"/>
+              <w:bottom w:w="100" w:type="dxa"/>
+              <w:right w:w="100" w:type="dxa"/>
+            </w:tcMar>
+          </w:tcPr>
+          <w:p>
+            <w:pPr>
+              <w:spacing w:after="0"/>
+              <w:ind w:firstLine="0"/>
+            </w:pPr>
+            <w:r>
+              <w:rPr>
+                <w:b/>
+                <w:color w:val="FFFFFF"/>
+                <w:sz w:val="17"/>
+              </w:rPr>
+              <w:t>如何记录</w:t>
+            </w:r>
+          </w:p>
+        </w:tc>
+        <w:tc>
+          <w:tcPr>
+            <w:tcW w:type="dxa" w:w="3099"/>
+            <w:vAlign w:val="center"/>
+            <w:shd w:fill="3f6f62"/>
+            <w:tcMar>
+              <w:top w:w="100" w:type="dxa"/>
+              <w:left w:w="100" w:type="dxa"/>
+              <w:bottom w:w="100" w:type="dxa"/>
+              <w:right w:w="100" w:type="dxa"/>
+            </w:tcMar>
+          </w:tcPr>
+          <w:p>
+            <w:pPr>
+              <w:spacing w:after="0"/>
+              <w:ind w:firstLine="0"/>
+            </w:pPr>
+            <w:r>
+              <w:rPr>
+                <w:b/>
+                <w:color w:val="FFFFFF"/>
+                <w:sz w:val="17"/>
+              </w:rPr>
+              <w:t>怎样解释</w:t>
+            </w:r>
+          </w:p>
+        </w:tc>
+      </w:tr>
+      <w:tr>
+        <w:tc>
+          <w:tcPr>
+            <w:tcW w:type="dxa" w:w="3099"/>
+            <w:vAlign w:val="center"/>
+            <w:shd w:fill="F5F6F5"/>
+            <w:tcMar>
+              <w:top w:w="100" w:type="dxa"/>
+              <w:left w:w="100" w:type="dxa"/>
+              <w:bottom w:w="100" w:type="dxa"/>
+              <w:right w:w="100" w:type="dxa"/>
+            </w:tcMar>
+          </w:tcPr>
+          <w:p>
+            <w:pPr>
+              <w:spacing w:after="0"/>
+              <w:ind w:firstLine="0"/>
+            </w:pPr>
+            <w:r>
+              <w:rPr>
+                <w:b w:val="0"/>
+                <w:color w:val="222222"/>
+                <w:sz w:val="17"/>
+              </w:rPr>
+              <w:t>旧信息误用</w:t>
+            </w:r>
+          </w:p>
+        </w:tc>
+        <w:tc>
+          <w:tcPr>
+            <w:tcW w:type="dxa" w:w="3099"/>
+            <w:vAlign w:val="center"/>
+            <w:shd w:fill="F5F6F5"/>
+            <w:tcMar>
+              <w:top w:w="100" w:type="dxa"/>
+              <w:left w:w="100" w:type="dxa"/>
+              <w:bottom w:w="100" w:type="dxa"/>
+              <w:right w:w="100" w:type="dxa"/>
+            </w:tcMar>
+          </w:tcPr>
+          <w:p>
+            <w:pPr>
+              <w:spacing w:after="0"/>
+              <w:ind w:firstLine="0"/>
+            </w:pPr>
+            <w:r>
+              <w:rPr>
+                <w:b w:val="0"/>
+                <w:color w:val="222222"/>
+                <w:sz w:val="17"/>
+              </w:rPr>
+              <w:t>报点时间 / 前压时间 / 事后复述</w:t>
+            </w:r>
+          </w:p>
+        </w:tc>
+        <w:tc>
+          <w:tcPr>
+            <w:tcW w:type="dxa" w:w="3099"/>
+            <w:vAlign w:val="center"/>
+            <w:shd w:fill="F5F6F5"/>
+            <w:tcMar>
+              <w:top w:w="100" w:type="dxa"/>
+              <w:left w:w="100" w:type="dxa"/>
+              <w:bottom w:w="100" w:type="dxa"/>
+              <w:right w:w="100" w:type="dxa"/>
+            </w:tcMar>
+          </w:tcPr>
+          <w:p>
+            <w:pPr>
+              <w:spacing w:after="0"/>
+              <w:ind w:firstLine="0"/>
+            </w:pPr>
+            <w:r>
+              <w:rPr>
+                <w:b w:val="0"/>
+                <w:color w:val="222222"/>
+                <w:sz w:val="17"/>
+              </w:rPr>
+              <w:t>是否把历史线索当实时位置</w:t>
+            </w:r>
+          </w:p>
+        </w:tc>
+      </w:tr>
+      <w:tr>
+        <w:tc>
+          <w:tcPr>
+            <w:tcW w:type="dxa" w:w="3099"/>
+            <w:vAlign w:val="center"/>
+            <w:shd w:fill="F5F6F5"/>
+            <w:tcMar>
+              <w:top w:w="100" w:type="dxa"/>
+              <w:left w:w="100" w:type="dxa"/>
+              <w:bottom w:w="100" w:type="dxa"/>
+              <w:right w:w="100" w:type="dxa"/>
+            </w:tcMar>
+          </w:tcPr>
+          <w:p>
+            <w:pPr>
+              <w:spacing w:after="0"/>
+              <w:ind w:firstLine="0"/>
+            </w:pPr>
+            <w:r>
+              <w:rPr>
+                <w:b w:val="0"/>
+                <w:color w:val="222222"/>
+                <w:sz w:val="17"/>
+              </w:rPr>
+              <w:t>队友跟进</w:t>
+            </w:r>
+          </w:p>
+        </w:tc>
+        <w:tc>
+          <w:tcPr>
+            <w:tcW w:type="dxa" w:w="3099"/>
+            <w:vAlign w:val="center"/>
+            <w:shd w:fill="F5F6F5"/>
+            <w:tcMar>
+              <w:top w:w="100" w:type="dxa"/>
+              <w:left w:w="100" w:type="dxa"/>
+              <w:bottom w:w="100" w:type="dxa"/>
+              <w:right w:w="100" w:type="dxa"/>
+            </w:tcMar>
+          </w:tcPr>
+          <w:p>
+            <w:pPr>
+              <w:spacing w:after="0"/>
+              <w:ind w:firstLine="0"/>
+            </w:pPr>
+            <w:r>
+              <w:rPr>
+                <w:b w:val="0"/>
+                <w:color w:val="222222"/>
+                <w:sz w:val="17"/>
+              </w:rPr>
+              <w:t>首人行动至第二人跟进间隔</w:t>
+            </w:r>
+          </w:p>
+        </w:tc>
+        <w:tc>
+          <w:tcPr>
+            <w:tcW w:type="dxa" w:w="3099"/>
+            <w:vAlign w:val="center"/>
+            <w:shd w:fill="F5F6F5"/>
+            <w:tcMar>
+              <w:top w:w="100" w:type="dxa"/>
+              <w:left w:w="100" w:type="dxa"/>
+              <w:bottom w:w="100" w:type="dxa"/>
+              <w:right w:w="100" w:type="dxa"/>
+            </w:tcMar>
+          </w:tcPr>
+          <w:p>
+            <w:pPr>
+              <w:spacing w:after="0"/>
+              <w:ind w:firstLine="0"/>
+            </w:pPr>
+            <w:r>
+              <w:rPr>
+                <w:b w:val="0"/>
+                <w:color w:val="222222"/>
+                <w:sz w:val="17"/>
+              </w:rPr>
+              <w:t>间隔缩短不自动等于更好</w:t>
+            </w:r>
+          </w:p>
+        </w:tc>
+      </w:tr>
+      <w:tr>
+        <w:tc>
+          <w:tcPr>
+            <w:tcW w:type="dxa" w:w="3099"/>
+            <w:vAlign w:val="center"/>
+            <w:shd w:fill="F5F6F5"/>
+            <w:tcMar>
+              <w:top w:w="100" w:type="dxa"/>
+              <w:left w:w="100" w:type="dxa"/>
+              <w:bottom w:w="100" w:type="dxa"/>
+              <w:right w:w="100" w:type="dxa"/>
+            </w:tcMar>
+          </w:tcPr>
+          <w:p>
+            <w:pPr>
+              <w:spacing w:after="0"/>
+              <w:ind w:firstLine="0"/>
+            </w:pPr>
+            <w:r>
+              <w:rPr>
+                <w:b w:val="0"/>
+                <w:color w:val="222222"/>
+                <w:sz w:val="17"/>
+              </w:rPr>
+              <w:t>路线选择</w:t>
+            </w:r>
+          </w:p>
+        </w:tc>
+        <w:tc>
+          <w:tcPr>
+            <w:tcW w:type="dxa" w:w="3099"/>
+            <w:vAlign w:val="center"/>
+            <w:shd w:fill="F5F6F5"/>
+            <w:tcMar>
+              <w:top w:w="100" w:type="dxa"/>
+              <w:left w:w="100" w:type="dxa"/>
+              <w:bottom w:w="100" w:type="dxa"/>
+              <w:right w:w="100" w:type="dxa"/>
+            </w:tcMar>
+          </w:tcPr>
+          <w:p>
+            <w:pPr>
+              <w:spacing w:after="0"/>
+              <w:ind w:firstLine="0"/>
+            </w:pPr>
+            <w:r>
+              <w:rPr>
+                <w:b w:val="0"/>
+                <w:color w:val="222222"/>
+                <w:sz w:val="17"/>
+              </w:rPr>
+              <w:t>同局面选择 A、B 或等待</w:t>
+            </w:r>
+          </w:p>
+        </w:tc>
+        <w:tc>
+          <w:tcPr>
+            <w:tcW w:type="dxa" w:w="3099"/>
+            <w:vAlign w:val="center"/>
+            <w:shd w:fill="F5F6F5"/>
+            <w:tcMar>
+              <w:top w:w="100" w:type="dxa"/>
+              <w:left w:w="100" w:type="dxa"/>
+              <w:bottom w:w="100" w:type="dxa"/>
+              <w:right w:w="100" w:type="dxa"/>
+            </w:tcMar>
+          </w:tcPr>
+          <w:p>
+            <w:pPr>
+              <w:spacing w:after="0"/>
+              <w:ind w:firstLine="0"/>
+            </w:pPr>
+            <w:r>
+              <w:rPr>
+                <w:b w:val="0"/>
+                <w:color w:val="222222"/>
+                <w:sz w:val="17"/>
+              </w:rPr>
+              <w:t>看选择理由能否对应证据</w:t>
+            </w:r>
+          </w:p>
+        </w:tc>
+      </w:tr>
+      <w:tr>
+        <w:tc>
+          <w:tcPr>
+            <w:tcW w:type="dxa" w:w="3099"/>
+            <w:vAlign w:val="center"/>
+            <w:shd w:fill="F5F6F5"/>
+            <w:tcMar>
+              <w:top w:w="100" w:type="dxa"/>
+              <w:left w:w="100" w:type="dxa"/>
+              <w:bottom w:w="100" w:type="dxa"/>
+              <w:right w:w="100" w:type="dxa"/>
+            </w:tcMar>
+          </w:tcPr>
+          <w:p>
+            <w:pPr>
+              <w:spacing w:after="0"/>
+              <w:ind w:firstLine="0"/>
+            </w:pPr>
+            <w:r>
+              <w:rPr>
+                <w:b w:val="0"/>
+                <w:color w:val="222222"/>
+                <w:sz w:val="17"/>
+              </w:rPr>
+              <w:t>界面负担</w:t>
+            </w:r>
+          </w:p>
+        </w:tc>
+        <w:tc>
+          <w:tcPr>
+            <w:tcW w:type="dxa" w:w="3099"/>
+            <w:vAlign w:val="center"/>
+            <w:shd w:fill="F5F6F5"/>
+            <w:tcMar>
+              <w:top w:w="100" w:type="dxa"/>
+              <w:left w:w="100" w:type="dxa"/>
+              <w:bottom w:w="100" w:type="dxa"/>
+              <w:right w:w="100" w:type="dxa"/>
+            </w:tcMar>
+          </w:tcPr>
+          <w:p>
+            <w:pPr>
+              <w:spacing w:after="0"/>
+              <w:ind w:firstLine="0"/>
+            </w:pPr>
+            <w:r>
+              <w:rPr>
+                <w:b w:val="0"/>
+                <w:color w:val="222222"/>
+                <w:sz w:val="17"/>
+              </w:rPr>
+              <w:t>漏看敌情 / 误读来源次数</w:t>
+            </w:r>
+          </w:p>
+        </w:tc>
+        <w:tc>
+          <w:tcPr>
+            <w:tcW w:type="dxa" w:w="3099"/>
+            <w:vAlign w:val="center"/>
+            <w:shd w:fill="F5F6F5"/>
+            <w:tcMar>
+              <w:top w:w="100" w:type="dxa"/>
+              <w:left w:w="100" w:type="dxa"/>
+              <w:bottom w:w="100" w:type="dxa"/>
+              <w:right w:w="100" w:type="dxa"/>
+            </w:tcMar>
+          </w:tcPr>
+          <w:p>
+            <w:pPr>
+              <w:spacing w:after="0"/>
+              <w:ind w:firstLine="0"/>
+            </w:pPr>
+            <w:r>
+              <w:rPr>
+                <w:b w:val="0"/>
+                <w:color w:val="222222"/>
+                <w:sz w:val="17"/>
+              </w:rPr>
+              <w:t>负担增加则方案需收回</w:t>
+            </w:r>
+          </w:p>
+        </w:tc>
+      </w:tr>
+      <w:tr>
+        <w:tc>
+          <w:tcPr>
+            <w:tcW w:type="dxa" w:w="3099"/>
+            <w:vAlign w:val="center"/>
+            <w:shd w:fill="F5F6F5"/>
+            <w:tcMar>
+              <w:top w:w="100" w:type="dxa"/>
+              <w:left w:w="100" w:type="dxa"/>
+              <w:bottom w:w="100" w:type="dxa"/>
+              <w:right w:w="100" w:type="dxa"/>
+            </w:tcMar>
+          </w:tcPr>
+          <w:p>
+            <w:pPr>
+              <w:spacing w:after="0"/>
+              <w:ind w:firstLine="0"/>
+            </w:pPr>
+            <w:r>
+              <w:rPr>
+                <w:b w:val="0"/>
+                <w:color w:val="222222"/>
+                <w:sz w:val="17"/>
+              </w:rPr>
+              <w:t>战果</w:t>
+            </w:r>
+          </w:p>
+        </w:tc>
+        <w:tc>
+          <w:tcPr>
+            <w:tcW w:type="dxa" w:w="3099"/>
+            <w:vAlign w:val="center"/>
+            <w:shd w:fill="F5F6F5"/>
+            <w:tcMar>
+              <w:top w:w="100" w:type="dxa"/>
+              <w:left w:w="100" w:type="dxa"/>
+              <w:bottom w:w="100" w:type="dxa"/>
+              <w:right w:w="100" w:type="dxa"/>
+            </w:tcMar>
+          </w:tcPr>
+          <w:p>
+            <w:pPr>
+              <w:spacing w:after="0"/>
+              <w:ind w:firstLine="0"/>
+            </w:pPr>
+            <w:r>
+              <w:rPr>
+                <w:b w:val="0"/>
+                <w:color w:val="222222"/>
+                <w:sz w:val="17"/>
+              </w:rPr>
+              <w:t>撤离与损失，仅作背景</w:t>
+            </w:r>
+          </w:p>
+        </w:tc>
+        <w:tc>
+          <w:tcPr>
+            <w:tcW w:type="dxa" w:w="3099"/>
+            <w:vAlign w:val="center"/>
+            <w:shd w:fill="F5F6F5"/>
+            <w:tcMar>
+              <w:top w:w="100" w:type="dxa"/>
+              <w:left w:w="100" w:type="dxa"/>
+              <w:bottom w:w="100" w:type="dxa"/>
+              <w:right w:w="100" w:type="dxa"/>
+            </w:tcMar>
+          </w:tcPr>
+          <w:p>
+            <w:pPr>
+              <w:spacing w:after="0"/>
+              <w:ind w:firstLine="0"/>
+            </w:pPr>
+            <w:r>
+              <w:rPr>
+                <w:b w:val="0"/>
+                <w:color w:val="222222"/>
+                <w:sz w:val="17"/>
+              </w:rPr>
+              <w:t>不能用小样本归因胜率提升</w:t>
+            </w:r>
+          </w:p>
+        </w:tc>
+      </w:tr>
+    </w:tbl>
+    <w:p/>
+    <w:p>
+      <w:r>
+        <w:t>本文的建议是让已有信息更容易被正确使用，而不是让小队知道更多敌人位置。</w:t>
+      </w:r>
+    </w:p>
+    <w:p>
+      <w:pPr>
+        <w:spacing w:line="264" w:lineRule="auto"/>
+        <w:ind w:firstLine="0"/>
+        <w:jc w:val="center"/>
+      </w:pPr>
+      <w:r>
+        <w:t>来源：D4</w:t>
+      </w:r>
+    </w:p>
+    <w:p>
+      <w:pPr>
+        <w:pStyle w:val="Heading1"/>
+      </w:pPr>
+      <w:r>
+        <w:t>16 结论与复核入口</w:t>
+      </w:r>
+    </w:p>
+    <w:p>
+      <w:r>
+        <w:t>干员系统的设计价值，在于提供不同的应对办法；它是否成立，要看这些办法有没有进入搜集、交战和撤离的实际选择。</w:t>
+      </w:r>
+    </w:p>
+    <w:p>
+      <w:pPr>
+        <w:pStyle w:val="Heading2"/>
+      </w:pPr>
+      <w:r>
+        <w:t>目前能支持的判断</w:t>
+      </w:r>
+    </w:p>
+    <w:p>
+      <w:r>
+        <w:t>红狼体现成功触发的持续推进，露娜提供改变路线的线索，蜂医处理部分战后状态，牧羊人给追击者增加处理步骤。它们都不能独自保证撤离。技能配置需要与物资、地形和队友行动一起解释。</w:t>
+      </w:r>
+    </w:p>
+    <w:p>
+      <w:pPr>
+        <w:pStyle w:val="Heading2"/>
+      </w:pPr>
+      <w:r>
+        <w:t>目前不能支持的判断</w:t>
+      </w:r>
+    </w:p>
+    <w:p>
+      <w:r>
+        <w:t>没有证据称某干员当前超模、某阵容撤离率更高，或本文建议一定有效。未用玩家出场率、胜率和虚构录像补足这些空白。下一步最有价值的材料是同条件下的真实对局记录，而非继续扩写职能介绍。</w:t>
+      </w:r>
+    </w:p>
+    <w:p>
+      <w:pPr>
+        <w:pStyle w:val="Heading2"/>
+      </w:pPr>
+      <w:r>
+        <w:t>方法来源与使用范围</w:t>
+      </w:r>
+    </w:p>
+    <w:p>
+      <w:r>
+        <w:t>知识库只用到 00-方法论的输入/反馈和边界检查、01-战斗系统的风险收益与决策维度、03-经济系统的资源投入与消耗概念。没有把其中通用比例当作本游戏平衡标准。所有路线图与演算均为本文自绘、自设。</w:t>
+      </w:r>
+    </w:p>
+    <w:p>
+      <w:r>
+        <w:t>图表：官方资料 / 文中编号可点击</w:t>
+      </w:r>
+    </w:p>
+    <w:p>
+      <w:r>
+        <w:t>可复述的核心：满包时，技能可能更常被用于避战；是否如此，需要按物资与小队协作条件验证。</w:t>
+      </w:r>
+    </w:p>
+    <w:p>
+      <w:pPr>
+        <w:spacing w:line="264" w:lineRule="auto"/>
+        <w:ind w:firstLine="0"/>
+        <w:jc w:val="center"/>
+      </w:pPr>
+      <w:r>
+        <w:t>来源：D1、D2、D3、D4</w:t>
       </w:r>
     </w:p>
     <w:sectPr>
       <w:footerReference w:type="default" r:id="rId9"/>
       <w:pgSz w:w="11906" w:h="16838"/>
-      <w:pgMar w:top="1247" w:right="1361" w:bottom="1247" w:left="1361" w:header="720" w:footer="720" w:gutter="0"/>
+      <w:pgMar w:top="1077" w:right="1304" w:bottom="1077" w:left="1304" w:header="720" w:footer="720" w:gutter="0"/>
       <w:cols w:space="720"/>
       <w:docGrid w:linePitch="360"/>
     </w:sectPr>
@@ -458,7 +4423,6 @@
   <w:p>
     <w:pPr>
       <w:pStyle w:val="Footer"/>
-      <w:ind w:firstLine="0"/>
       <w:jc w:val="center"/>
     </w:pPr>
     <w:fldSimple w:instr="PAGE"/>
@@ -831,13 +4795,13 @@
     <w:rsid w:val="00FC693F"/>
     <w:pPr>
       <w:widowControl/>
-      <w:spacing w:line="360" w:lineRule="auto" w:after="140"/>
-      <w:ind w:firstLine="440"/>
+      <w:spacing w:line="348" w:lineRule="auto" w:after="120"/>
+      <w:ind w:firstLine="420"/>
     </w:pPr>
     <w:rPr>
       <w:rFonts w:ascii="Times New Roman" w:hAnsi="Times New Roman" w:eastAsia="宋体"/>
       <w:color w:val="000000"/>
-      <w:sz w:val="22"/>
+      <w:sz w:val="21"/>
     </w:rPr>
   </w:style>
   <w:style w:type="paragraph" w:styleId="Header">
@@ -895,7 +4859,7 @@
     <w:pPr>
       <w:keepNext/>
       <w:keepLines/>
-      <w:spacing w:before="280" w:after="160"/>
+      <w:spacing w:before="300" w:after="140"/>
       <w:ind w:firstLine="0"/>
       <w:outlineLvl w:val="0"/>
     </w:pPr>
@@ -904,7 +4868,7 @@
       <w:b/>
       <w:bCs/>
       <w:color w:val="000000"/>
-      <w:sz w:val="30"/>
+      <w:sz w:val="32"/>
       <w:szCs w:val="28"/>
     </w:rPr>
   </w:style>
@@ -920,7 +4884,7 @@
     <w:pPr>
       <w:keepNext/>
       <w:keepLines/>
-      <w:spacing w:before="280" w:after="160"/>
+      <w:spacing w:before="300" w:after="140"/>
       <w:ind w:firstLine="0"/>
       <w:outlineLvl w:val="1"/>
     </w:pPr>
@@ -929,7 +4893,7 @@
       <w:b/>
       <w:bCs/>
       <w:color w:val="000000"/>
-      <w:sz w:val="24"/>
+      <w:sz w:val="25"/>
       <w:szCs w:val="26"/>
     </w:rPr>
   </w:style>
@@ -1183,9 +5147,7 @@
     <w:qFormat/>
     <w:rsid w:val="00FC693F"/>
     <w:pPr>
-      <w:keepNext/>
-      <w:spacing w:after="160" w:line="240" w:lineRule="auto" w:before="0"/>
-      <w:ind w:firstLine="0"/>
+      <w:spacing w:after="300" w:line="240" w:lineRule="auto"/>
       <w:contextualSpacing/>
     </w:pPr>
     <w:rPr>
@@ -1193,7 +5155,7 @@
       <w:color w:val="000000"/>
       <w:spacing w:val="5"/>
       <w:kern w:val="28"/>
-      <w:sz w:val="40"/>
+      <w:sz w:val="48"/>
       <w:szCs w:val="52"/>
     </w:rPr>
   </w:style>
@@ -1631,10 +5593,9 @@
       <w:spacing w:line="240" w:lineRule="auto"/>
     </w:pPr>
     <w:rPr>
-      <w:rFonts w:ascii="Times New Roman" w:hAnsi="Times New Roman" w:eastAsia="黑体"/>
       <w:b/>
       <w:bCs/>
-      <w:color w:val="000000"/>
+      <w:color w:val="4F81BD" w:themeColor="accent1"/>
       <w:sz w:val="18"/>
       <w:szCs w:val="18"/>
     </w:rPr>

</xml_diff>